<commit_message>
try to fix enumerator-still has issues
</commit_message>
<xml_diff>
--- a/Wouldwork User Manual(26.7).docx
+++ b/Wouldwork User Manual(26.7).docx
@@ -28713,7 +28713,7 @@
     <w:p>
       <w:pPr>
         <w:pStyle w:val="NoSpacing"/>
-        <w:ind w:left="720"/>
+        <w:ind w:left="630"/>
         <w:rPr>
           <w:rFonts w:ascii="Courier New" w:hAnsi="Courier New" w:cs="Courier New"/>
           <w:sz w:val="18"/>
@@ -28745,7 +28745,7 @@
           <w:sz w:val="18"/>
           <w:szCs w:val="28"/>
         </w:rPr>
-        <w:t xml:space="preserve"> </w:t>
+        <w:t>&gt; *depth-cutoff* = D (pos integer) or 0 (deep</w:t>
       </w:r>
       <w:r>
         <w:rPr>
@@ -28753,7 +28753,7 @@
           <w:sz w:val="18"/>
           <w:szCs w:val="28"/>
         </w:rPr>
-        <w:t>&gt; *depth-cutoff* = D (pos integer) or 0 (deep</w:t>
+        <w:t xml:space="preserve"> search</w:t>
       </w:r>
       <w:r>
         <w:rPr>
@@ -28761,16 +28761,18 @@
           <w:sz w:val="18"/>
           <w:szCs w:val="28"/>
         </w:rPr>
-        <w:t xml:space="preserve"> search</w:t>
-      </w:r>
-      <w:r>
+        <w:t>)</w:t>
+      </w:r>
+    </w:p>
+    <w:p>
+      <w:pPr>
+        <w:pStyle w:val="NoSpacing"/>
         <w:rPr>
           <w:rFonts w:ascii="Courier New" w:hAnsi="Courier New" w:cs="Courier New"/>
           <w:sz w:val="18"/>
           <w:szCs w:val="28"/>
         </w:rPr>
-        <w:t>)</w:t>
-      </w:r>
+      </w:pPr>
     </w:p>
     <w:p>
       <w:pPr>
@@ -28781,61 +28783,61 @@
           <w:szCs w:val="28"/>
         </w:rPr>
       </w:pPr>
-    </w:p>
-    <w:p>
-      <w:pPr>
-        <w:pStyle w:val="NoSpacing"/>
+      <w:r>
         <w:rPr>
           <w:rFonts w:ascii="Courier New" w:hAnsi="Courier New" w:cs="Courier New"/>
           <w:sz w:val="18"/>
           <w:szCs w:val="28"/>
         </w:rPr>
-      </w:pPr>
-      <w:r>
+        <w:t xml:space="preserve">   2. Find Every Path</w:t>
+      </w:r>
+    </w:p>
+    <w:p>
+      <w:pPr>
+        <w:pStyle w:val="NoSpacing"/>
         <w:rPr>
           <w:rFonts w:ascii="Courier New" w:hAnsi="Courier New" w:cs="Courier New"/>
           <w:sz w:val="18"/>
           <w:szCs w:val="28"/>
         </w:rPr>
-        <w:t xml:space="preserve">   2. Find Every Path</w:t>
-      </w:r>
-    </w:p>
-    <w:p>
-      <w:pPr>
-        <w:pStyle w:val="NoSpacing"/>
+      </w:pPr>
+      <w:r>
         <w:rPr>
           <w:rFonts w:ascii="Courier New" w:hAnsi="Courier New" w:cs="Courier New"/>
           <w:sz w:val="18"/>
           <w:szCs w:val="28"/>
         </w:rPr>
-      </w:pPr>
-      <w:r>
+        <w:t xml:space="preserve">      </w:t>
+      </w:r>
+    </w:p>
+    <w:p>
+      <w:pPr>
+        <w:pStyle w:val="NoSpacing"/>
+        <w:ind w:left="720"/>
         <w:rPr>
           <w:rFonts w:ascii="Courier New" w:hAnsi="Courier New" w:cs="Courier New"/>
           <w:sz w:val="18"/>
           <w:szCs w:val="28"/>
         </w:rPr>
-        <w:t xml:space="preserve">      </w:t>
-      </w:r>
-    </w:p>
-    <w:p>
-      <w:pPr>
-        <w:pStyle w:val="NoSpacing"/>
-        <w:ind w:left="720"/>
+      </w:pPr>
+      <w:r>
         <w:rPr>
           <w:rFonts w:ascii="Courier New" w:hAnsi="Courier New" w:cs="Courier New"/>
           <w:sz w:val="18"/>
           <w:szCs w:val="28"/>
         </w:rPr>
-      </w:pPr>
-      <w:r>
+        <w:t>Use this when you need to find every possible path to a goal, including different routes to the same goal. Note that the number of paths can grow very quickly in problems with many action choices. Use a depth cutoff &gt; 0 if the exhaustive search takes too long.</w:t>
+      </w:r>
+    </w:p>
+    <w:p>
+      <w:pPr>
+        <w:pStyle w:val="NoSpacing"/>
         <w:rPr>
           <w:rFonts w:ascii="Courier New" w:hAnsi="Courier New" w:cs="Courier New"/>
           <w:sz w:val="18"/>
           <w:szCs w:val="28"/>
         </w:rPr>
-        <w:t>Use this when you need to find every possible path to a goal, including different routes to the same goal. Note that the number of paths can grow very quickly in problems with many action choices. Use a depth cutoff &gt; 0 if the exhaustive search takes too long.</w:t>
-      </w:r>
+      </w:pPr>
     </w:p>
     <w:p>
       <w:pPr>
@@ -28846,60 +28848,65 @@
           <w:szCs w:val="28"/>
         </w:rPr>
       </w:pPr>
-    </w:p>
-    <w:p>
-      <w:pPr>
-        <w:pStyle w:val="NoSpacing"/>
+      <w:r>
         <w:rPr>
           <w:rFonts w:ascii="Courier New" w:hAnsi="Courier New" w:cs="Courier New"/>
           <w:sz w:val="18"/>
           <w:szCs w:val="28"/>
         </w:rPr>
-      </w:pPr>
-      <w:r>
+        <w:t xml:space="preserve">      &gt; Set *tree-or-graph* = tree</w:t>
+      </w:r>
+    </w:p>
+    <w:p>
+      <w:pPr>
+        <w:pStyle w:val="NoSpacing"/>
         <w:rPr>
           <w:rFonts w:ascii="Courier New" w:hAnsi="Courier New" w:cs="Courier New"/>
           <w:sz w:val="18"/>
           <w:szCs w:val="28"/>
         </w:rPr>
-        <w:t xml:space="preserve">     </w:t>
-      </w:r>
-      <w:r>
+      </w:pPr>
+    </w:p>
+    <w:p>
+      <w:pPr>
+        <w:pStyle w:val="NoSpacing"/>
         <w:rPr>
           <w:rFonts w:ascii="Courier New" w:hAnsi="Courier New" w:cs="Courier New"/>
           <w:sz w:val="18"/>
           <w:szCs w:val="28"/>
         </w:rPr>
-        <w:t xml:space="preserve"> </w:t>
-      </w:r>
+      </w:pPr>
       <w:r>
         <w:rPr>
           <w:rFonts w:ascii="Courier New" w:hAnsi="Courier New" w:cs="Courier New"/>
           <w:sz w:val="18"/>
           <w:szCs w:val="28"/>
         </w:rPr>
-        <w:t xml:space="preserve"> </w:t>
-      </w:r>
-      <w:r>
+        <w:t xml:space="preserve">   3. Use Search Pruning to Avoid Unneeded Solutions</w:t>
+      </w:r>
+    </w:p>
+    <w:p>
+      <w:pPr>
+        <w:pStyle w:val="NoSpacing"/>
         <w:rPr>
           <w:rFonts w:ascii="Courier New" w:hAnsi="Courier New" w:cs="Courier New"/>
           <w:sz w:val="18"/>
           <w:szCs w:val="28"/>
         </w:rPr>
-        <w:t xml:space="preserve">&gt; </w:t>
-      </w:r>
+      </w:pPr>
       <w:r>
         <w:rPr>
           <w:rFonts w:ascii="Courier New" w:hAnsi="Courier New" w:cs="Courier New"/>
           <w:sz w:val="18"/>
           <w:szCs w:val="28"/>
         </w:rPr>
-        <w:t>*solution-type* = every</w:t>
-      </w:r>
-    </w:p>
-    <w:p>
-      <w:pPr>
-        <w:pStyle w:val="NoSpacing"/>
+        <w:t xml:space="preserve">        </w:t>
+      </w:r>
+    </w:p>
+    <w:p>
+      <w:pPr>
+        <w:pStyle w:val="NoSpacing"/>
+        <w:ind w:left="720"/>
         <w:rPr>
           <w:rFonts w:ascii="Courier New" w:hAnsi="Courier New" w:cs="Courier New"/>
           <w:sz w:val="18"/>
@@ -28912,16 +28919,18 @@
           <w:sz w:val="18"/>
           <w:szCs w:val="28"/>
         </w:rPr>
-        <w:t xml:space="preserve">       </w:t>
-      </w:r>
-      <w:r>
+        <w:t>These options reduce the search space, making the search faster and reducing memory usage. They can be combined as needed.</w:t>
+      </w:r>
+    </w:p>
+    <w:p>
+      <w:pPr>
+        <w:pStyle w:val="NoSpacing"/>
         <w:rPr>
           <w:rFonts w:ascii="Courier New" w:hAnsi="Courier New" w:cs="Courier New"/>
           <w:sz w:val="18"/>
           <w:szCs w:val="28"/>
         </w:rPr>
-        <w:t>&gt; *tree-or-graph* = tree</w:t>
-      </w:r>
+      </w:pPr>
     </w:p>
     <w:p>
       <w:pPr>
@@ -28932,106 +28941,30 @@
           <w:szCs w:val="28"/>
         </w:rPr>
       </w:pPr>
-    </w:p>
-    <w:p>
-      <w:pPr>
-        <w:pStyle w:val="NoSpacing"/>
+      <w:r>
         <w:rPr>
           <w:rFonts w:ascii="Courier New" w:hAnsi="Courier New" w:cs="Courier New"/>
           <w:sz w:val="18"/>
           <w:szCs w:val="28"/>
         </w:rPr>
-      </w:pPr>
-      <w:r>
+        <w:t xml:space="preserve">      a. Depth Bounded</w:t>
+      </w:r>
+    </w:p>
+    <w:p>
+      <w:pPr>
+        <w:pStyle w:val="NoSpacing"/>
         <w:rPr>
           <w:rFonts w:ascii="Courier New" w:hAnsi="Courier New" w:cs="Courier New"/>
           <w:sz w:val="18"/>
           <w:szCs w:val="28"/>
         </w:rPr>
-        <w:t xml:space="preserve">   3. Use Search Pruning to Avoid Unneeded Solutions</w:t>
-      </w:r>
-    </w:p>
-    <w:p>
-      <w:pPr>
-        <w:pStyle w:val="NoSpacing"/>
+      </w:pPr>
+      <w:r>
         <w:rPr>
           <w:rFonts w:ascii="Courier New" w:hAnsi="Courier New" w:cs="Courier New"/>
           <w:sz w:val="18"/>
           <w:szCs w:val="28"/>
         </w:rPr>
-      </w:pPr>
-      <w:r>
-        <w:rPr>
-          <w:rFonts w:ascii="Courier New" w:hAnsi="Courier New" w:cs="Courier New"/>
-          <w:sz w:val="18"/>
-          <w:szCs w:val="28"/>
-        </w:rPr>
-        <w:t xml:space="preserve">        </w:t>
-      </w:r>
-    </w:p>
-    <w:p>
-      <w:pPr>
-        <w:pStyle w:val="NoSpacing"/>
-        <w:ind w:left="720"/>
-        <w:rPr>
-          <w:rFonts w:ascii="Courier New" w:hAnsi="Courier New" w:cs="Courier New"/>
-          <w:sz w:val="18"/>
-          <w:szCs w:val="28"/>
-        </w:rPr>
-      </w:pPr>
-      <w:r>
-        <w:rPr>
-          <w:rFonts w:ascii="Courier New" w:hAnsi="Courier New" w:cs="Courier New"/>
-          <w:sz w:val="18"/>
-          <w:szCs w:val="28"/>
-        </w:rPr>
-        <w:t>These options reduce the search space, making the search faster and reducing memory usage. They can be combined as needed.</w:t>
-      </w:r>
-    </w:p>
-    <w:p>
-      <w:pPr>
-        <w:pStyle w:val="NoSpacing"/>
-        <w:rPr>
-          <w:rFonts w:ascii="Courier New" w:hAnsi="Courier New" w:cs="Courier New"/>
-          <w:sz w:val="18"/>
-          <w:szCs w:val="28"/>
-        </w:rPr>
-      </w:pPr>
-    </w:p>
-    <w:p>
-      <w:pPr>
-        <w:pStyle w:val="NoSpacing"/>
-        <w:rPr>
-          <w:rFonts w:ascii="Courier New" w:hAnsi="Courier New" w:cs="Courier New"/>
-          <w:sz w:val="18"/>
-          <w:szCs w:val="28"/>
-        </w:rPr>
-      </w:pPr>
-      <w:r>
-        <w:rPr>
-          <w:rFonts w:ascii="Courier New" w:hAnsi="Courier New" w:cs="Courier New"/>
-          <w:sz w:val="18"/>
-          <w:szCs w:val="28"/>
-        </w:rPr>
-        <w:t xml:space="preserve">      a. Depth Bounded</w:t>
-      </w:r>
-    </w:p>
-    <w:p>
-      <w:pPr>
-        <w:pStyle w:val="NoSpacing"/>
-        <w:rPr>
-          <w:rFonts w:ascii="Courier New" w:hAnsi="Courier New" w:cs="Courier New"/>
-          <w:sz w:val="18"/>
-          <w:szCs w:val="28"/>
-        </w:rPr>
-      </w:pPr>
-      <w:r>
-        <w:rPr>
-          <w:rFonts w:ascii="Courier New" w:hAnsi="Courier New" w:cs="Courier New"/>
-          <w:sz w:val="18"/>
-          <w:szCs w:val="28"/>
-        </w:rPr>
-        <w:lastRenderedPageBreak/>
         <w:t xml:space="preserve">          </w:t>
       </w:r>
     </w:p>
@@ -29054,6 +28987,7 @@
           <w:sz w:val="18"/>
           <w:szCs w:val="28"/>
         </w:rPr>
+        <w:lastRenderedPageBreak/>
         <w:t xml:space="preserve">Limits the search to paths of at most </w:t>
       </w:r>
       <w:r>
@@ -29114,7 +29048,7 @@
           <w:sz w:val="18"/>
           <w:szCs w:val="28"/>
         </w:rPr>
-        <w:t xml:space="preserve">&gt; *depth-cutoff* = </w:t>
+        <w:t xml:space="preserve">&gt; Set *depth-cutoff* = </w:t>
       </w:r>
       <w:r>
         <w:rPr>
@@ -29265,7 +29199,7 @@
           <w:sz w:val="18"/>
           <w:szCs w:val="28"/>
         </w:rPr>
-        <w:t>&gt; *tree-or-graph* = graph</w:t>
+        <w:t>&gt; Set *tree-or-graph* = graph</w:t>
       </w:r>
     </w:p>
     <w:p>
@@ -29368,7 +29302,7 @@
           <w:sz w:val="18"/>
           <w:szCs w:val="28"/>
         </w:rPr>
-        <w:t>&gt; *symmetry-pruning* = t</w:t>
+        <w:t>&gt; Set *symmetry-pruning* = t</w:t>
       </w:r>
     </w:p>
     <w:p>
@@ -29435,29 +29369,33 @@
         </w:rPr>
         <w:t>Use these options when you want the best path according to a specific criterion. The search will prune paths that cannot improve on the best solution found so far.</w:t>
       </w:r>
-      <w:r>
+    </w:p>
+    <w:p>
+      <w:pPr>
+        <w:pStyle w:val="NoSpacing"/>
         <w:rPr>
           <w:rFonts w:ascii="Courier New" w:hAnsi="Courier New" w:cs="Courier New"/>
           <w:sz w:val="18"/>
           <w:szCs w:val="28"/>
         </w:rPr>
-        <w:t xml:space="preserve"> </w:t>
-      </w:r>
-      <w:r>
+      </w:pPr>
+    </w:p>
+    <w:p>
+      <w:pPr>
+        <w:pStyle w:val="NoSpacing"/>
         <w:rPr>
           <w:rFonts w:ascii="Courier New" w:hAnsi="Courier New" w:cs="Courier New"/>
           <w:sz w:val="18"/>
           <w:szCs w:val="28"/>
         </w:rPr>
-        <w:t>With min-value/max-value and no goal, results are tracked in *best-states*; with a goal, best goal-reaching solutions are in *solutions*/*unique-solutions*</w:t>
-      </w:r>
+      </w:pPr>
       <w:r>
         <w:rPr>
           <w:rFonts w:ascii="Courier New" w:hAnsi="Courier New" w:cs="Courier New"/>
           <w:sz w:val="18"/>
           <w:szCs w:val="28"/>
         </w:rPr>
-        <w:t>.</w:t>
+        <w:t xml:space="preserve">      a. Fewest Steps</w:t>
       </w:r>
     </w:p>
     <w:p>
@@ -29469,85 +29407,85 @@
           <w:szCs w:val="28"/>
         </w:rPr>
       </w:pPr>
-    </w:p>
-    <w:p>
-      <w:pPr>
-        <w:pStyle w:val="NoSpacing"/>
+      <w:r>
         <w:rPr>
           <w:rFonts w:ascii="Courier New" w:hAnsi="Courier New" w:cs="Courier New"/>
           <w:sz w:val="18"/>
           <w:szCs w:val="28"/>
         </w:rPr>
-      </w:pPr>
-      <w:r>
+        <w:t xml:space="preserve">        </w:t>
+      </w:r>
+    </w:p>
+    <w:p>
+      <w:pPr>
+        <w:pStyle w:val="NoSpacing"/>
+        <w:ind w:left="990"/>
         <w:rPr>
           <w:rFonts w:ascii="Courier New" w:hAnsi="Courier New" w:cs="Courier New"/>
           <w:sz w:val="18"/>
           <w:szCs w:val="28"/>
         </w:rPr>
-        <w:t xml:space="preserve">      a. Fewest Steps</w:t>
-      </w:r>
-    </w:p>
-    <w:p>
-      <w:pPr>
-        <w:pStyle w:val="NoSpacing"/>
+      </w:pPr>
+      <w:r>
         <w:rPr>
           <w:rFonts w:ascii="Courier New" w:hAnsi="Courier New" w:cs="Courier New"/>
           <w:sz w:val="18"/>
           <w:szCs w:val="28"/>
         </w:rPr>
-      </w:pPr>
-      <w:r>
+        <w:t>Finds the shortest path measured by number of actions.</w:t>
+      </w:r>
+    </w:p>
+    <w:p>
+      <w:pPr>
+        <w:pStyle w:val="NoSpacing"/>
+        <w:ind w:left="990"/>
         <w:rPr>
           <w:rFonts w:ascii="Courier New" w:hAnsi="Courier New" w:cs="Courier New"/>
           <w:sz w:val="18"/>
           <w:szCs w:val="28"/>
         </w:rPr>
-        <w:t xml:space="preserve">        </w:t>
-      </w:r>
-    </w:p>
-    <w:p>
-      <w:pPr>
-        <w:pStyle w:val="NoSpacing"/>
-        <w:ind w:left="990"/>
+      </w:pPr>
+      <w:r>
         <w:rPr>
           <w:rFonts w:ascii="Courier New" w:hAnsi="Courier New" w:cs="Courier New"/>
           <w:sz w:val="18"/>
           <w:szCs w:val="28"/>
         </w:rPr>
-      </w:pPr>
-      <w:r>
+        <w:t xml:space="preserve">        </w:t>
+      </w:r>
+    </w:p>
+    <w:p>
+      <w:pPr>
+        <w:pStyle w:val="NoSpacing"/>
+        <w:ind w:left="990"/>
         <w:rPr>
           <w:rFonts w:ascii="Courier New" w:hAnsi="Courier New" w:cs="Courier New"/>
           <w:sz w:val="18"/>
           <w:szCs w:val="28"/>
         </w:rPr>
-        <w:t>Finds the shortest path measured by number of actions.</w:t>
-      </w:r>
-    </w:p>
-    <w:p>
-      <w:pPr>
-        <w:pStyle w:val="NoSpacing"/>
-        <w:ind w:left="990"/>
+      </w:pPr>
+      <w:r>
         <w:rPr>
           <w:rFonts w:ascii="Courier New" w:hAnsi="Courier New" w:cs="Courier New"/>
           <w:sz w:val="18"/>
           <w:szCs w:val="28"/>
         </w:rPr>
-      </w:pPr>
-      <w:r>
+        <w:t>&gt; Set *solution-type* = min-length</w:t>
+      </w:r>
+    </w:p>
+    <w:p>
+      <w:pPr>
+        <w:pStyle w:val="NoSpacing"/>
         <w:rPr>
           <w:rFonts w:ascii="Courier New" w:hAnsi="Courier New" w:cs="Courier New"/>
           <w:sz w:val="18"/>
           <w:szCs w:val="28"/>
         </w:rPr>
-        <w:t xml:space="preserve">        </w:t>
-      </w:r>
-    </w:p>
-    <w:p>
-      <w:pPr>
-        <w:pStyle w:val="NoSpacing"/>
-        <w:ind w:left="990"/>
+      </w:pPr>
+    </w:p>
+    <w:p>
+      <w:pPr>
+        <w:pStyle w:val="NoSpacing"/>
         <w:rPr>
           <w:rFonts w:ascii="Courier New" w:hAnsi="Courier New" w:cs="Courier New"/>
           <w:sz w:val="18"/>
@@ -29560,7 +29498,7 @@
           <w:sz w:val="18"/>
           <w:szCs w:val="28"/>
         </w:rPr>
-        <w:t>&gt; *solution-type* = min-length</w:t>
+        <w:t xml:space="preserve">      b. Shortest Duration</w:t>
       </w:r>
     </w:p>
     <w:p>
@@ -29572,85 +29510,85 @@
           <w:szCs w:val="28"/>
         </w:rPr>
       </w:pPr>
-    </w:p>
-    <w:p>
-      <w:pPr>
-        <w:pStyle w:val="NoSpacing"/>
+      <w:r>
         <w:rPr>
           <w:rFonts w:ascii="Courier New" w:hAnsi="Courier New" w:cs="Courier New"/>
           <w:sz w:val="18"/>
           <w:szCs w:val="28"/>
         </w:rPr>
-      </w:pPr>
-      <w:r>
+        <w:t xml:space="preserve">        </w:t>
+      </w:r>
+    </w:p>
+    <w:p>
+      <w:pPr>
+        <w:pStyle w:val="NoSpacing"/>
+        <w:ind w:left="990"/>
         <w:rPr>
           <w:rFonts w:ascii="Courier New" w:hAnsi="Courier New" w:cs="Courier New"/>
           <w:sz w:val="18"/>
           <w:szCs w:val="28"/>
         </w:rPr>
-        <w:t xml:space="preserve">      b. Shortest Duration</w:t>
-      </w:r>
-    </w:p>
-    <w:p>
-      <w:pPr>
-        <w:pStyle w:val="NoSpacing"/>
+      </w:pPr>
+      <w:r>
         <w:rPr>
           <w:rFonts w:ascii="Courier New" w:hAnsi="Courier New" w:cs="Courier New"/>
           <w:sz w:val="18"/>
           <w:szCs w:val="28"/>
         </w:rPr>
-      </w:pPr>
-      <w:r>
+        <w:t>Finds the fastest path measured by total time elapsed. Requires that actions have associated durations.</w:t>
+      </w:r>
+    </w:p>
+    <w:p>
+      <w:pPr>
+        <w:pStyle w:val="NoSpacing"/>
+        <w:ind w:left="990"/>
         <w:rPr>
           <w:rFonts w:ascii="Courier New" w:hAnsi="Courier New" w:cs="Courier New"/>
           <w:sz w:val="18"/>
           <w:szCs w:val="28"/>
         </w:rPr>
-        <w:t xml:space="preserve">        </w:t>
-      </w:r>
-    </w:p>
-    <w:p>
-      <w:pPr>
-        <w:pStyle w:val="NoSpacing"/>
-        <w:ind w:left="990"/>
+      </w:pPr>
+      <w:r>
         <w:rPr>
           <w:rFonts w:ascii="Courier New" w:hAnsi="Courier New" w:cs="Courier New"/>
           <w:sz w:val="18"/>
           <w:szCs w:val="28"/>
         </w:rPr>
-      </w:pPr>
-      <w:r>
+        <w:t xml:space="preserve">        </w:t>
+      </w:r>
+    </w:p>
+    <w:p>
+      <w:pPr>
+        <w:pStyle w:val="NoSpacing"/>
+        <w:ind w:left="990"/>
         <w:rPr>
           <w:rFonts w:ascii="Courier New" w:hAnsi="Courier New" w:cs="Courier New"/>
           <w:sz w:val="18"/>
           <w:szCs w:val="28"/>
         </w:rPr>
-        <w:t>Finds the fastest path measured by total time elapsed. Requires that actions have associated durations.</w:t>
-      </w:r>
-    </w:p>
-    <w:p>
-      <w:pPr>
-        <w:pStyle w:val="NoSpacing"/>
-        <w:ind w:left="990"/>
+      </w:pPr>
+      <w:r>
         <w:rPr>
           <w:rFonts w:ascii="Courier New" w:hAnsi="Courier New" w:cs="Courier New"/>
           <w:sz w:val="18"/>
           <w:szCs w:val="28"/>
         </w:rPr>
-      </w:pPr>
-      <w:r>
+        <w:t>&gt; Set *solution-type* = min-time</w:t>
+      </w:r>
+    </w:p>
+    <w:p>
+      <w:pPr>
+        <w:pStyle w:val="NoSpacing"/>
         <w:rPr>
           <w:rFonts w:ascii="Courier New" w:hAnsi="Courier New" w:cs="Courier New"/>
           <w:sz w:val="18"/>
           <w:szCs w:val="28"/>
         </w:rPr>
-        <w:t xml:space="preserve">        </w:t>
-      </w:r>
-    </w:p>
-    <w:p>
-      <w:pPr>
-        <w:pStyle w:val="NoSpacing"/>
-        <w:ind w:left="990"/>
+      </w:pPr>
+    </w:p>
+    <w:p>
+      <w:pPr>
+        <w:pStyle w:val="NoSpacing"/>
         <w:rPr>
           <w:rFonts w:ascii="Courier New" w:hAnsi="Courier New" w:cs="Courier New"/>
           <w:sz w:val="18"/>
@@ -29663,7 +29601,7 @@
           <w:sz w:val="18"/>
           <w:szCs w:val="28"/>
         </w:rPr>
-        <w:t>&gt; *solution-type* = min-time</w:t>
+        <w:t xml:space="preserve">      c. Minimum Cost</w:t>
       </w:r>
     </w:p>
     <w:p>
@@ -29675,96 +29613,93 @@
           <w:szCs w:val="28"/>
         </w:rPr>
       </w:pPr>
-    </w:p>
-    <w:p>
-      <w:pPr>
-        <w:pStyle w:val="NoSpacing"/>
+      <w:r>
         <w:rPr>
           <w:rFonts w:ascii="Courier New" w:hAnsi="Courier New" w:cs="Courier New"/>
           <w:sz w:val="18"/>
           <w:szCs w:val="28"/>
         </w:rPr>
-      </w:pPr>
-      <w:r>
+        <w:t xml:space="preserve">        </w:t>
+      </w:r>
+    </w:p>
+    <w:p>
+      <w:pPr>
+        <w:pStyle w:val="NoSpacing"/>
+        <w:ind w:left="990"/>
         <w:rPr>
           <w:rFonts w:ascii="Courier New" w:hAnsi="Courier New" w:cs="Courier New"/>
           <w:sz w:val="18"/>
           <w:szCs w:val="28"/>
         </w:rPr>
-        <w:t xml:space="preserve">      c. Minimum Cost</w:t>
-      </w:r>
-    </w:p>
-    <w:p>
-      <w:pPr>
-        <w:pStyle w:val="NoSpacing"/>
+      </w:pPr>
+      <w:r>
         <w:rPr>
           <w:rFonts w:ascii="Courier New" w:hAnsi="Courier New" w:cs="Courier New"/>
           <w:sz w:val="18"/>
           <w:szCs w:val="28"/>
         </w:rPr>
-      </w:pPr>
+        <w:t>Finds the path with the lowest accumulated cost or value.</w:t>
+      </w:r>
       <w:r>
         <w:rPr>
           <w:rFonts w:ascii="Courier New" w:hAnsi="Courier New" w:cs="Courier New"/>
           <w:sz w:val="18"/>
           <w:szCs w:val="28"/>
         </w:rPr>
-        <w:t xml:space="preserve">        </w:t>
-      </w:r>
-    </w:p>
-    <w:p>
-      <w:pPr>
-        <w:pStyle w:val="NoSpacing"/>
-        <w:ind w:left="990"/>
+        <w:t xml:space="preserve"> </w:t>
+      </w:r>
+      <w:r>
         <w:rPr>
           <w:rFonts w:ascii="Courier New" w:hAnsi="Courier New" w:cs="Courier New"/>
           <w:sz w:val="18"/>
           <w:szCs w:val="28"/>
         </w:rPr>
-      </w:pPr>
-      <w:r>
+        <w:t>Requires a value function defined in the problem specification.</w:t>
+      </w:r>
+    </w:p>
+    <w:p>
+      <w:pPr>
+        <w:pStyle w:val="NoSpacing"/>
+        <w:ind w:left="990" w:firstLine="90"/>
         <w:rPr>
           <w:rFonts w:ascii="Courier New" w:hAnsi="Courier New" w:cs="Courier New"/>
           <w:sz w:val="18"/>
           <w:szCs w:val="28"/>
         </w:rPr>
-        <w:t>Finds the path with the lowest accumulated cost or value.</w:t>
-      </w:r>
+      </w:pPr>
       <w:r>
         <w:rPr>
           <w:rFonts w:ascii="Courier New" w:hAnsi="Courier New" w:cs="Courier New"/>
           <w:sz w:val="18"/>
           <w:szCs w:val="28"/>
         </w:rPr>
-        <w:t xml:space="preserve"> </w:t>
-      </w:r>
-      <w:r>
+        <w:t xml:space="preserve">        </w:t>
+      </w:r>
+    </w:p>
+    <w:p>
+      <w:pPr>
+        <w:pStyle w:val="NoSpacing"/>
         <w:rPr>
           <w:rFonts w:ascii="Courier New" w:hAnsi="Courier New" w:cs="Courier New"/>
           <w:sz w:val="18"/>
           <w:szCs w:val="28"/>
         </w:rPr>
-        <w:t>Requires a value function defined in the problem specification.</w:t>
-      </w:r>
-    </w:p>
-    <w:p>
-      <w:pPr>
-        <w:pStyle w:val="NoSpacing"/>
-        <w:ind w:left="990" w:firstLine="90"/>
+      </w:pPr>
+      <w:r>
         <w:rPr>
           <w:rFonts w:ascii="Courier New" w:hAnsi="Courier New" w:cs="Courier New"/>
           <w:sz w:val="18"/>
           <w:szCs w:val="28"/>
         </w:rPr>
-      </w:pPr>
+        <w:t xml:space="preserve">         </w:t>
+      </w:r>
       <w:r>
         <w:rPr>
           <w:rFonts w:ascii="Courier New" w:hAnsi="Courier New" w:cs="Courier New"/>
           <w:sz w:val="18"/>
           <w:szCs w:val="28"/>
         </w:rPr>
-        <w:lastRenderedPageBreak/>
-        <w:t xml:space="preserve">        </w:t>
+        <w:t>&gt; Set *solution-type* = min-value</w:t>
       </w:r>
     </w:p>
     <w:p>
@@ -29776,21 +29711,23 @@
           <w:szCs w:val="28"/>
         </w:rPr>
       </w:pPr>
-      <w:r>
+    </w:p>
+    <w:p>
+      <w:pPr>
+        <w:pStyle w:val="NoSpacing"/>
         <w:rPr>
           <w:rFonts w:ascii="Courier New" w:hAnsi="Courier New" w:cs="Courier New"/>
           <w:sz w:val="18"/>
           <w:szCs w:val="28"/>
         </w:rPr>
-        <w:t xml:space="preserve">         </w:t>
-      </w:r>
+      </w:pPr>
       <w:r>
         <w:rPr>
           <w:rFonts w:ascii="Courier New" w:hAnsi="Courier New" w:cs="Courier New"/>
           <w:sz w:val="18"/>
           <w:szCs w:val="28"/>
         </w:rPr>
-        <w:t>&gt; *solution-type* = min-value</w:t>
+        <w:t xml:space="preserve">      d. Maximum Reward</w:t>
       </w:r>
     </w:p>
     <w:p>
@@ -29802,85 +29739,86 @@
           <w:szCs w:val="28"/>
         </w:rPr>
       </w:pPr>
-    </w:p>
-    <w:p>
-      <w:pPr>
-        <w:pStyle w:val="NoSpacing"/>
+      <w:r>
         <w:rPr>
           <w:rFonts w:ascii="Courier New" w:hAnsi="Courier New" w:cs="Courier New"/>
           <w:sz w:val="18"/>
           <w:szCs w:val="28"/>
         </w:rPr>
-      </w:pPr>
-      <w:r>
+        <w:lastRenderedPageBreak/>
+        <w:t xml:space="preserve">        </w:t>
+      </w:r>
+    </w:p>
+    <w:p>
+      <w:pPr>
+        <w:pStyle w:val="NoSpacing"/>
+        <w:ind w:left="990"/>
         <w:rPr>
           <w:rFonts w:ascii="Courier New" w:hAnsi="Courier New" w:cs="Courier New"/>
           <w:sz w:val="18"/>
           <w:szCs w:val="28"/>
         </w:rPr>
-        <w:t xml:space="preserve">      d. Maximum Reward</w:t>
-      </w:r>
-    </w:p>
-    <w:p>
-      <w:pPr>
-        <w:pStyle w:val="NoSpacing"/>
+      </w:pPr>
+      <w:r>
         <w:rPr>
           <w:rFonts w:ascii="Courier New" w:hAnsi="Courier New" w:cs="Courier New"/>
           <w:sz w:val="18"/>
           <w:szCs w:val="28"/>
         </w:rPr>
-      </w:pPr>
-      <w:r>
+        <w:t>Finds the path with the highest accumulated value. Requires a value function defined in the problem specification.</w:t>
+      </w:r>
+    </w:p>
+    <w:p>
+      <w:pPr>
+        <w:pStyle w:val="NoSpacing"/>
+        <w:ind w:left="990"/>
         <w:rPr>
           <w:rFonts w:ascii="Courier New" w:hAnsi="Courier New" w:cs="Courier New"/>
           <w:sz w:val="18"/>
           <w:szCs w:val="28"/>
         </w:rPr>
-        <w:t xml:space="preserve">        </w:t>
-      </w:r>
-    </w:p>
-    <w:p>
-      <w:pPr>
-        <w:pStyle w:val="NoSpacing"/>
-        <w:ind w:left="990"/>
+      </w:pPr>
+      <w:r>
         <w:rPr>
           <w:rFonts w:ascii="Courier New" w:hAnsi="Courier New" w:cs="Courier New"/>
           <w:sz w:val="18"/>
           <w:szCs w:val="28"/>
         </w:rPr>
-      </w:pPr>
-      <w:r>
+        <w:t xml:space="preserve">        </w:t>
+      </w:r>
+    </w:p>
+    <w:p>
+      <w:pPr>
+        <w:pStyle w:val="NoSpacing"/>
+        <w:ind w:left="990"/>
         <w:rPr>
           <w:rFonts w:ascii="Courier New" w:hAnsi="Courier New" w:cs="Courier New"/>
           <w:sz w:val="18"/>
           <w:szCs w:val="28"/>
         </w:rPr>
-        <w:t>Finds the path with the highest accumulated value. Requires a value function defined in the problem specification.</w:t>
-      </w:r>
-    </w:p>
-    <w:p>
-      <w:pPr>
-        <w:pStyle w:val="NoSpacing"/>
-        <w:ind w:left="990"/>
+      </w:pPr>
+      <w:r>
         <w:rPr>
           <w:rFonts w:ascii="Courier New" w:hAnsi="Courier New" w:cs="Courier New"/>
           <w:sz w:val="18"/>
           <w:szCs w:val="28"/>
         </w:rPr>
-      </w:pPr>
-      <w:r>
+        <w:t>&gt; Set *solution-type* = max-value</w:t>
+      </w:r>
+    </w:p>
+    <w:p>
+      <w:pPr>
+        <w:pStyle w:val="NoSpacing"/>
         <w:rPr>
           <w:rFonts w:ascii="Courier New" w:hAnsi="Courier New" w:cs="Courier New"/>
           <w:sz w:val="18"/>
           <w:szCs w:val="28"/>
         </w:rPr>
-        <w:t xml:space="preserve">        </w:t>
-      </w:r>
-    </w:p>
-    <w:p>
-      <w:pPr>
-        <w:pStyle w:val="NoSpacing"/>
-        <w:ind w:left="990"/>
+      </w:pPr>
+    </w:p>
+    <w:p>
+      <w:pPr>
+        <w:pStyle w:val="NoSpacing"/>
         <w:rPr>
           <w:rFonts w:ascii="Courier New" w:hAnsi="Courier New" w:cs="Courier New"/>
           <w:sz w:val="18"/>
@@ -29893,7 +29831,7 @@
           <w:sz w:val="18"/>
           <w:szCs w:val="28"/>
         </w:rPr>
-        <w:t>&gt; *solution-type* = max-value</w:t>
+        <w:t>B. CSP (finding goal states satisfying constraints)</w:t>
       </w:r>
     </w:p>
     <w:p>
@@ -29905,60 +29843,56 @@
           <w:szCs w:val="28"/>
         </w:rPr>
       </w:pPr>
-    </w:p>
-    <w:p>
-      <w:pPr>
-        <w:pStyle w:val="NoSpacing"/>
+      <w:r>
         <w:rPr>
           <w:rFonts w:ascii="Courier New" w:hAnsi="Courier New" w:cs="Courier New"/>
           <w:sz w:val="18"/>
           <w:szCs w:val="28"/>
         </w:rPr>
-      </w:pPr>
-      <w:r>
+        <w:t xml:space="preserve">  </w:t>
+      </w:r>
+    </w:p>
+    <w:p>
+      <w:pPr>
+        <w:pStyle w:val="NoSpacing"/>
+        <w:ind w:left="360"/>
         <w:rPr>
           <w:rFonts w:ascii="Courier New" w:hAnsi="Courier New" w:cs="Courier New"/>
           <w:sz w:val="18"/>
           <w:szCs w:val="28"/>
         </w:rPr>
-        <w:t>B. CSP (finding goal states satisfying constraints)</w:t>
-      </w:r>
-    </w:p>
-    <w:p>
-      <w:pPr>
-        <w:pStyle w:val="NoSpacing"/>
+      </w:pPr>
+      <w:r>
         <w:rPr>
           <w:rFonts w:ascii="Courier New" w:hAnsi="Courier New" w:cs="Courier New"/>
           <w:sz w:val="18"/>
           <w:szCs w:val="28"/>
         </w:rPr>
-      </w:pPr>
+        <w:t>The primary output is *</w:t>
+      </w:r>
       <w:r>
         <w:rPr>
           <w:rFonts w:ascii="Courier New" w:hAnsi="Courier New" w:cs="Courier New"/>
           <w:sz w:val="18"/>
           <w:szCs w:val="28"/>
         </w:rPr>
-        <w:t xml:space="preserve">  </w:t>
-      </w:r>
-    </w:p>
-    <w:p>
-      <w:pPr>
-        <w:pStyle w:val="NoSpacing"/>
-        <w:ind w:left="360"/>
+        <w:t>unique-solutions</w:t>
+      </w:r>
+      <w:r>
         <w:rPr>
           <w:rFonts w:ascii="Courier New" w:hAnsi="Courier New" w:cs="Courier New"/>
           <w:sz w:val="18"/>
           <w:szCs w:val="28"/>
         </w:rPr>
-      </w:pPr>
+        <w:t>*</w:t>
+      </w:r>
       <w:r>
         <w:rPr>
           <w:rFonts w:ascii="Courier New" w:hAnsi="Courier New" w:cs="Courier New"/>
           <w:sz w:val="18"/>
           <w:szCs w:val="28"/>
         </w:rPr>
-        <w:t>The primary output is *</w:t>
+        <w:t xml:space="preserve"> (</w:t>
       </w:r>
       <w:r>
         <w:rPr>
@@ -29966,7 +29900,7 @@
           <w:sz w:val="18"/>
           <w:szCs w:val="28"/>
         </w:rPr>
-        <w:t>unique-solutions</w:t>
+        <w:t>which contains the goal states found</w:t>
       </w:r>
       <w:r>
         <w:rPr>
@@ -29974,7 +29908,7 @@
           <w:sz w:val="18"/>
           <w:szCs w:val="28"/>
         </w:rPr>
-        <w:t>*</w:t>
+        <w:t>, along with the sequence of variable assignments—a.k.a. a path)</w:t>
       </w:r>
       <w:r>
         <w:rPr>
@@ -29982,7 +29916,7 @@
           <w:sz w:val="18"/>
           <w:szCs w:val="28"/>
         </w:rPr>
-        <w:t xml:space="preserve"> (</w:t>
+        <w:t xml:space="preserve">. Each state represents a complete assignment of values that satisfies the goal condition. For CSP problems, *tree-or-graph* defaults to </w:t>
       </w:r>
       <w:r>
         <w:rPr>
@@ -29990,7 +29924,7 @@
           <w:sz w:val="18"/>
           <w:szCs w:val="28"/>
         </w:rPr>
-        <w:t>which contains the goal states found</w:t>
+        <w:t>tree</w:t>
       </w:r>
       <w:r>
         <w:rPr>
@@ -29998,7 +29932,7 @@
           <w:sz w:val="18"/>
           <w:szCs w:val="28"/>
         </w:rPr>
-        <w:t>, along with the sequence of variable assignments—a.k.a. a path)</w:t>
+        <w:t xml:space="preserve"> search</w:t>
       </w:r>
       <w:r>
         <w:rPr>
@@ -30006,7 +29940,7 @@
           <w:sz w:val="18"/>
           <w:szCs w:val="28"/>
         </w:rPr>
-        <w:t xml:space="preserve">. Each state represents a complete assignment of values that satisfies the goal condition. For CSP problems, *tree-or-graph* defaults to </w:t>
+        <w:t xml:space="preserve"> to make sure all possible variable assignments are tried, but graph search may be more efficient</w:t>
       </w:r>
       <w:r>
         <w:rPr>
@@ -30014,31 +29948,37 @@
           <w:sz w:val="18"/>
           <w:szCs w:val="28"/>
         </w:rPr>
-        <w:t>tree</w:t>
-      </w:r>
-      <w:r>
+        <w:t>.</w:t>
+      </w:r>
+    </w:p>
+    <w:p>
+      <w:pPr>
+        <w:pStyle w:val="NoSpacing"/>
+        <w:ind w:left="360"/>
         <w:rPr>
           <w:rFonts w:ascii="Courier New" w:hAnsi="Courier New" w:cs="Courier New"/>
           <w:sz w:val="18"/>
           <w:szCs w:val="28"/>
         </w:rPr>
-        <w:t xml:space="preserve"> search</w:t>
-      </w:r>
-      <w:r>
+      </w:pPr>
+    </w:p>
+    <w:p>
+      <w:pPr>
+        <w:pStyle w:val="NoSpacing"/>
+        <w:ind w:left="360"/>
         <w:rPr>
           <w:rFonts w:ascii="Courier New" w:hAnsi="Courier New" w:cs="Courier New"/>
           <w:sz w:val="18"/>
           <w:szCs w:val="28"/>
         </w:rPr>
-        <w:t xml:space="preserve"> to make sure all possible variable assignments are tried, but graph search may be more efficient</w:t>
-      </w:r>
+      </w:pPr>
       <w:r>
         <w:rPr>
           <w:rFonts w:ascii="Courier New" w:hAnsi="Courier New" w:cs="Courier New"/>
           <w:sz w:val="18"/>
           <w:szCs w:val="28"/>
         </w:rPr>
-        <w:t>.</w:t>
+        <w:t>&gt; *problem-type* = csp</w:t>
       </w:r>
     </w:p>
     <w:p>
@@ -30051,71 +29991,67 @@
           <w:szCs w:val="28"/>
         </w:rPr>
       </w:pPr>
-    </w:p>
-    <w:p>
-      <w:pPr>
-        <w:pStyle w:val="NoSpacing"/>
-        <w:ind w:left="360"/>
+      <w:r>
         <w:rPr>
           <w:rFonts w:ascii="Courier New" w:hAnsi="Courier New" w:cs="Courier New"/>
           <w:sz w:val="18"/>
           <w:szCs w:val="28"/>
         </w:rPr>
-      </w:pPr>
+        <w:t xml:space="preserve">&gt; *tree-or-graph* = </w:t>
+      </w:r>
       <w:r>
         <w:rPr>
           <w:rFonts w:ascii="Courier New" w:hAnsi="Courier New" w:cs="Courier New"/>
           <w:sz w:val="18"/>
           <w:szCs w:val="28"/>
         </w:rPr>
-        <w:t>&gt; *problem-type* = csp</w:t>
-      </w:r>
-    </w:p>
-    <w:p>
-      <w:pPr>
-        <w:pStyle w:val="NoSpacing"/>
-        <w:ind w:left="360"/>
+        <w:t>tree</w:t>
+      </w:r>
+      <w:r>
         <w:rPr>
           <w:rFonts w:ascii="Courier New" w:hAnsi="Courier New" w:cs="Courier New"/>
           <w:sz w:val="18"/>
           <w:szCs w:val="28"/>
         </w:rPr>
-      </w:pPr>
+        <w:t xml:space="preserve"> (default) or </w:t>
+      </w:r>
       <w:r>
         <w:rPr>
           <w:rFonts w:ascii="Courier New" w:hAnsi="Courier New" w:cs="Courier New"/>
           <w:sz w:val="18"/>
           <w:szCs w:val="28"/>
         </w:rPr>
-        <w:t xml:space="preserve">&gt; </w:t>
-      </w:r>
-      <w:r>
+        <w:t>graph</w:t>
+      </w:r>
+    </w:p>
+    <w:p>
+      <w:pPr>
+        <w:pStyle w:val="NoSpacing"/>
+        <w:ind w:left="360"/>
         <w:rPr>
           <w:rFonts w:ascii="Courier New" w:hAnsi="Courier New" w:cs="Courier New"/>
           <w:sz w:val="18"/>
           <w:szCs w:val="28"/>
         </w:rPr>
-        <w:t>*tree-or-graph* = graph (default), tree is usually better</w:t>
-      </w:r>
-    </w:p>
-    <w:p>
-      <w:pPr>
-        <w:pStyle w:val="NoSpacing"/>
-        <w:ind w:left="360"/>
+      </w:pPr>
+      <w:r>
         <w:rPr>
           <w:rFonts w:ascii="Courier New" w:hAnsi="Courier New" w:cs="Courier New"/>
           <w:sz w:val="18"/>
           <w:szCs w:val="28"/>
         </w:rPr>
-      </w:pPr>
-      <w:r>
+        <w:t>&gt; *algorithm* = depth-first (default) or backtracking</w:t>
+      </w:r>
+    </w:p>
+    <w:p>
+      <w:pPr>
+        <w:pStyle w:val="NoSpacing"/>
         <w:rPr>
           <w:rFonts w:ascii="Courier New" w:hAnsi="Courier New" w:cs="Courier New"/>
           <w:sz w:val="18"/>
           <w:szCs w:val="28"/>
         </w:rPr>
-        <w:t>&gt; *algorithm* = depth-first (default) or backtracking</w:t>
-      </w:r>
+      </w:pPr>
     </w:p>
     <w:p>
       <w:pPr>
@@ -30126,68 +30062,66 @@
           <w:szCs w:val="28"/>
         </w:rPr>
       </w:pPr>
-    </w:p>
-    <w:p>
-      <w:pPr>
-        <w:pStyle w:val="NoSpacing"/>
+      <w:r>
         <w:rPr>
           <w:rFonts w:ascii="Courier New" w:hAnsi="Courier New" w:cs="Courier New"/>
           <w:sz w:val="18"/>
           <w:szCs w:val="28"/>
         </w:rPr>
-      </w:pPr>
+        <w:t xml:space="preserve">   1. Find One or a Few Goal State</w:t>
+      </w:r>
       <w:r>
         <w:rPr>
           <w:rFonts w:ascii="Courier New" w:hAnsi="Courier New" w:cs="Courier New"/>
           <w:sz w:val="18"/>
           <w:szCs w:val="28"/>
         </w:rPr>
-        <w:t xml:space="preserve">   1. Find One or a Few Goal State</w:t>
-      </w:r>
-      <w:r>
+        <w:t xml:space="preserve"> Configurations</w:t>
+      </w:r>
+    </w:p>
+    <w:p>
+      <w:pPr>
+        <w:pStyle w:val="NoSpacing"/>
         <w:rPr>
           <w:rFonts w:ascii="Courier New" w:hAnsi="Courier New" w:cs="Courier New"/>
           <w:sz w:val="18"/>
           <w:szCs w:val="28"/>
         </w:rPr>
-        <w:t xml:space="preserve"> Configurations</w:t>
-      </w:r>
-    </w:p>
-    <w:p>
-      <w:pPr>
-        <w:pStyle w:val="NoSpacing"/>
+      </w:pPr>
+      <w:r>
         <w:rPr>
           <w:rFonts w:ascii="Courier New" w:hAnsi="Courier New" w:cs="Courier New"/>
           <w:sz w:val="18"/>
           <w:szCs w:val="28"/>
         </w:rPr>
-      </w:pPr>
-      <w:r>
+        <w:t xml:space="preserve">      </w:t>
+      </w:r>
+    </w:p>
+    <w:p>
+      <w:pPr>
+        <w:pStyle w:val="NoSpacing"/>
+        <w:ind w:left="720"/>
         <w:rPr>
           <w:rFonts w:ascii="Courier New" w:hAnsi="Courier New" w:cs="Courier New"/>
           <w:sz w:val="18"/>
           <w:szCs w:val="28"/>
         </w:rPr>
-        <w:t xml:space="preserve">      </w:t>
-      </w:r>
-    </w:p>
-    <w:p>
-      <w:pPr>
-        <w:pStyle w:val="NoSpacing"/>
-        <w:ind w:left="720"/>
+      </w:pPr>
+      <w:r>
         <w:rPr>
           <w:rFonts w:ascii="Courier New" w:hAnsi="Courier New" w:cs="Courier New"/>
           <w:sz w:val="18"/>
           <w:szCs w:val="28"/>
         </w:rPr>
-      </w:pPr>
+        <w:t xml:space="preserve">Use this when you want to find </w:t>
+      </w:r>
       <w:r>
         <w:rPr>
           <w:rFonts w:ascii="Courier New" w:hAnsi="Courier New" w:cs="Courier New"/>
           <w:sz w:val="18"/>
           <w:szCs w:val="28"/>
         </w:rPr>
-        <w:t xml:space="preserve">Use this when you want to find </w:t>
+        <w:t>goal-</w:t>
       </w:r>
       <w:r>
         <w:rPr>
@@ -30195,72 +30129,72 @@
           <w:sz w:val="18"/>
           <w:szCs w:val="28"/>
         </w:rPr>
-        <w:t>goal-</w:t>
-      </w:r>
-      <w:r>
+        <w:t>satisfying states without optimizing for any particular criterion.</w:t>
+      </w:r>
+    </w:p>
+    <w:p>
+      <w:pPr>
+        <w:pStyle w:val="NoSpacing"/>
+        <w:ind w:left="720"/>
         <w:rPr>
           <w:rFonts w:ascii="Courier New" w:hAnsi="Courier New" w:cs="Courier New"/>
           <w:sz w:val="18"/>
           <w:szCs w:val="28"/>
         </w:rPr>
-        <w:t>satisfying states without optimizing for any particular criterion.</w:t>
-      </w:r>
-    </w:p>
-    <w:p>
-      <w:pPr>
-        <w:pStyle w:val="NoSpacing"/>
-        <w:ind w:left="720"/>
+      </w:pPr>
+      <w:r>
         <w:rPr>
           <w:rFonts w:ascii="Courier New" w:hAnsi="Courier New" w:cs="Courier New"/>
           <w:sz w:val="18"/>
           <w:szCs w:val="28"/>
         </w:rPr>
-      </w:pPr>
-      <w:r>
+        <w:t xml:space="preserve">      </w:t>
+      </w:r>
+    </w:p>
+    <w:p>
+      <w:pPr>
+        <w:pStyle w:val="NoSpacing"/>
+        <w:ind w:left="720"/>
         <w:rPr>
           <w:rFonts w:ascii="Courier New" w:hAnsi="Courier New" w:cs="Courier New"/>
           <w:sz w:val="18"/>
           <w:szCs w:val="28"/>
         </w:rPr>
-        <w:t xml:space="preserve">      </w:t>
-      </w:r>
-    </w:p>
-    <w:p>
-      <w:pPr>
-        <w:pStyle w:val="NoSpacing"/>
-        <w:ind w:left="720"/>
+      </w:pPr>
+      <w:r>
         <w:rPr>
           <w:rFonts w:ascii="Courier New" w:hAnsi="Courier New" w:cs="Courier New"/>
           <w:sz w:val="18"/>
           <w:szCs w:val="28"/>
         </w:rPr>
-      </w:pPr>
-      <w:r>
+        <w:t>&gt; *solution-type* = first or &lt;n&gt; (pos integer)</w:t>
+      </w:r>
+    </w:p>
+    <w:p>
+      <w:pPr>
+        <w:pStyle w:val="NoSpacing"/>
+        <w:ind w:left="720"/>
         <w:rPr>
           <w:rFonts w:ascii="Courier New" w:hAnsi="Courier New" w:cs="Courier New"/>
           <w:sz w:val="18"/>
           <w:szCs w:val="28"/>
         </w:rPr>
-        <w:t>&gt; *solution-type* = first or &lt;n&gt; (pos integer)</w:t>
-      </w:r>
-    </w:p>
-    <w:p>
-      <w:pPr>
-        <w:pStyle w:val="NoSpacing"/>
-        <w:ind w:left="720"/>
+      </w:pPr>
+      <w:r>
         <w:rPr>
           <w:rFonts w:ascii="Courier New" w:hAnsi="Courier New" w:cs="Courier New"/>
           <w:sz w:val="18"/>
           <w:szCs w:val="28"/>
         </w:rPr>
-      </w:pPr>
+        <w:t xml:space="preserve">&gt; *tree-or-graph* = </w:t>
+      </w:r>
       <w:r>
         <w:rPr>
           <w:rFonts w:ascii="Courier New" w:hAnsi="Courier New" w:cs="Courier New"/>
           <w:sz w:val="18"/>
           <w:szCs w:val="28"/>
         </w:rPr>
-        <w:t xml:space="preserve">&gt; *tree-or-graph* = </w:t>
+        <w:t>tree</w:t>
       </w:r>
       <w:r>
         <w:rPr>
@@ -30268,7 +30202,7 @@
           <w:sz w:val="18"/>
           <w:szCs w:val="28"/>
         </w:rPr>
-        <w:t>tree</w:t>
+        <w:t xml:space="preserve"> (default) or </w:t>
       </w:r>
       <w:r>
         <w:rPr>
@@ -30276,16 +30210,18 @@
           <w:sz w:val="18"/>
           <w:szCs w:val="28"/>
         </w:rPr>
-        <w:t xml:space="preserve"> (default) or </w:t>
-      </w:r>
-      <w:r>
+        <w:t>graph</w:t>
+      </w:r>
+    </w:p>
+    <w:p>
+      <w:pPr>
+        <w:pStyle w:val="NoSpacing"/>
         <w:rPr>
           <w:rFonts w:ascii="Courier New" w:hAnsi="Courier New" w:cs="Courier New"/>
           <w:sz w:val="18"/>
           <w:szCs w:val="28"/>
         </w:rPr>
-        <w:t>graph</w:t>
-      </w:r>
+      </w:pPr>
     </w:p>
     <w:p>
       <w:pPr>
@@ -30296,61 +30232,62 @@
           <w:szCs w:val="28"/>
         </w:rPr>
       </w:pPr>
-    </w:p>
-    <w:p>
-      <w:pPr>
-        <w:pStyle w:val="NoSpacing"/>
+      <w:r>
         <w:rPr>
           <w:rFonts w:ascii="Courier New" w:hAnsi="Courier New" w:cs="Courier New"/>
           <w:sz w:val="18"/>
           <w:szCs w:val="28"/>
         </w:rPr>
-      </w:pPr>
+        <w:t xml:space="preserve">   2. Find Every Goal State</w:t>
+      </w:r>
       <w:r>
         <w:rPr>
           <w:rFonts w:ascii="Courier New" w:hAnsi="Courier New" w:cs="Courier New"/>
           <w:sz w:val="18"/>
           <w:szCs w:val="28"/>
         </w:rPr>
-        <w:t xml:space="preserve">   2. Find Every Goal State</w:t>
-      </w:r>
-      <w:r>
+        <w:t xml:space="preserve"> Configuration</w:t>
+      </w:r>
+    </w:p>
+    <w:p>
+      <w:pPr>
+        <w:pStyle w:val="NoSpacing"/>
         <w:rPr>
           <w:rFonts w:ascii="Courier New" w:hAnsi="Courier New" w:cs="Courier New"/>
           <w:sz w:val="18"/>
           <w:szCs w:val="28"/>
         </w:rPr>
-        <w:t xml:space="preserve"> Configuration</w:t>
-      </w:r>
-    </w:p>
-    <w:p>
-      <w:pPr>
-        <w:pStyle w:val="NoSpacing"/>
+      </w:pPr>
+    </w:p>
+    <w:p>
+      <w:pPr>
+        <w:pStyle w:val="NoSpacing"/>
+        <w:ind w:left="630"/>
         <w:rPr>
           <w:rFonts w:ascii="Courier New" w:hAnsi="Courier New" w:cs="Courier New"/>
           <w:sz w:val="18"/>
           <w:szCs w:val="28"/>
         </w:rPr>
       </w:pPr>
-    </w:p>
-    <w:p>
-      <w:pPr>
-        <w:pStyle w:val="NoSpacing"/>
-        <w:ind w:left="630"/>
+      <w:r>
         <w:rPr>
           <w:rFonts w:ascii="Courier New" w:hAnsi="Courier New" w:cs="Courier New"/>
           <w:sz w:val="18"/>
           <w:szCs w:val="28"/>
         </w:rPr>
-      </w:pPr>
-      <w:r>
+        <w:t>Use this when you need to find every possible state satisfying a goal. Note that the number of states can grow very quickly in problems with many variables or many values of those variables.</w:t>
+      </w:r>
+    </w:p>
+    <w:p>
+      <w:pPr>
+        <w:pStyle w:val="NoSpacing"/>
+        <w:ind w:left="630"/>
         <w:rPr>
           <w:rFonts w:ascii="Courier New" w:hAnsi="Courier New" w:cs="Courier New"/>
           <w:sz w:val="18"/>
           <w:szCs w:val="28"/>
         </w:rPr>
-        <w:t>Use this when you need to find every possible state satisfying a goal. Note that the number of states can grow very quickly in problems with many variables or many values of those variables.</w:t>
-      </w:r>
+      </w:pPr>
     </w:p>
     <w:p>
       <w:pPr>
@@ -30362,136 +30299,135 @@
           <w:szCs w:val="28"/>
         </w:rPr>
       </w:pPr>
-    </w:p>
-    <w:p>
-      <w:pPr>
-        <w:pStyle w:val="NoSpacing"/>
-        <w:ind w:left="630"/>
+      <w:r>
         <w:rPr>
           <w:rFonts w:ascii="Courier New" w:hAnsi="Courier New" w:cs="Courier New"/>
           <w:sz w:val="18"/>
           <w:szCs w:val="28"/>
         </w:rPr>
-      </w:pPr>
-      <w:r>
+        <w:t>&gt; *solution-type* = every</w:t>
+      </w:r>
+    </w:p>
+    <w:p>
+      <w:pPr>
+        <w:pStyle w:val="NoSpacing"/>
         <w:rPr>
           <w:rFonts w:ascii="Courier New" w:hAnsi="Courier New" w:cs="Courier New"/>
           <w:sz w:val="18"/>
           <w:szCs w:val="28"/>
         </w:rPr>
-        <w:t>&gt; *solution-type* = every</w:t>
-      </w:r>
-    </w:p>
-    <w:p>
-      <w:pPr>
-        <w:pStyle w:val="NoSpacing"/>
+      </w:pPr>
+      <w:r>
         <w:rPr>
           <w:rFonts w:ascii="Courier New" w:hAnsi="Courier New" w:cs="Courier New"/>
           <w:sz w:val="18"/>
           <w:szCs w:val="28"/>
         </w:rPr>
-      </w:pPr>
-      <w:r>
+        <w:t xml:space="preserve">     </w:t>
+      </w:r>
+    </w:p>
+    <w:p>
+      <w:pPr>
+        <w:pStyle w:val="NoSpacing"/>
         <w:rPr>
           <w:rFonts w:ascii="Courier New" w:hAnsi="Courier New" w:cs="Courier New"/>
           <w:sz w:val="18"/>
           <w:szCs w:val="28"/>
         </w:rPr>
-        <w:t xml:space="preserve">     </w:t>
-      </w:r>
-    </w:p>
-    <w:p>
-      <w:pPr>
-        <w:pStyle w:val="NoSpacing"/>
+      </w:pPr>
+      <w:r>
         <w:rPr>
           <w:rFonts w:ascii="Courier New" w:hAnsi="Courier New" w:cs="Courier New"/>
           <w:sz w:val="18"/>
           <w:szCs w:val="28"/>
         </w:rPr>
-      </w:pPr>
-      <w:r>
+        <w:t xml:space="preserve">   3. Exclude Symmetric States</w:t>
+      </w:r>
+    </w:p>
+    <w:p>
+      <w:pPr>
+        <w:pStyle w:val="NoSpacing"/>
         <w:rPr>
           <w:rFonts w:ascii="Courier New" w:hAnsi="Courier New" w:cs="Courier New"/>
           <w:sz w:val="18"/>
           <w:szCs w:val="28"/>
         </w:rPr>
-        <w:t xml:space="preserve">   3. Exclude Symmetric States</w:t>
-      </w:r>
-    </w:p>
-    <w:p>
-      <w:pPr>
-        <w:pStyle w:val="NoSpacing"/>
+      </w:pPr>
+      <w:r>
         <w:rPr>
           <w:rFonts w:ascii="Courier New" w:hAnsi="Courier New" w:cs="Courier New"/>
           <w:sz w:val="18"/>
           <w:szCs w:val="28"/>
         </w:rPr>
-      </w:pPr>
-      <w:r>
+        <w:t xml:space="preserve">        </w:t>
+      </w:r>
+    </w:p>
+    <w:p>
+      <w:pPr>
+        <w:pStyle w:val="NoSpacing"/>
+        <w:ind w:left="720"/>
         <w:rPr>
           <w:rFonts w:ascii="Courier New" w:hAnsi="Courier New" w:cs="Courier New"/>
           <w:sz w:val="18"/>
           <w:szCs w:val="28"/>
         </w:rPr>
-        <w:t xml:space="preserve">        </w:t>
-      </w:r>
-    </w:p>
-    <w:p>
-      <w:pPr>
-        <w:pStyle w:val="NoSpacing"/>
-        <w:ind w:left="720"/>
+      </w:pPr>
+      <w:r>
         <w:rPr>
           <w:rFonts w:ascii="Courier New" w:hAnsi="Courier New" w:cs="Courier New"/>
           <w:sz w:val="18"/>
           <w:szCs w:val="28"/>
         </w:rPr>
-      </w:pPr>
-      <w:r>
+        <w:t>When multiple states are equivalent under symmetry (such as permutations of interchangeable objects), this option records only one canonical representative from each equivalence class. This is particularly useful when the problem has inherent symmetries that would otherwise produce many "different" solutions that are essentially the same.</w:t>
+      </w:r>
+    </w:p>
+    <w:p>
+      <w:pPr>
+        <w:pStyle w:val="NoSpacing"/>
+        <w:ind w:left="720"/>
         <w:rPr>
           <w:rFonts w:ascii="Courier New" w:hAnsi="Courier New" w:cs="Courier New"/>
           <w:sz w:val="18"/>
           <w:szCs w:val="28"/>
         </w:rPr>
-        <w:t>When multiple states are equivalent under symmetry (such as permutations of interchangeable objects), this option records only one canonical representative from each equivalence class. This is particularly useful when the problem has inherent symmetries that would otherwise produce many "different" solutions that are essentially the same.</w:t>
-      </w:r>
-    </w:p>
-    <w:p>
-      <w:pPr>
-        <w:pStyle w:val="NoSpacing"/>
-        <w:ind w:left="720"/>
+      </w:pPr>
+      <w:r>
         <w:rPr>
           <w:rFonts w:ascii="Courier New" w:hAnsi="Courier New" w:cs="Courier New"/>
           <w:sz w:val="18"/>
           <w:szCs w:val="28"/>
         </w:rPr>
-      </w:pPr>
-      <w:r>
+        <w:t xml:space="preserve">        </w:t>
+      </w:r>
+    </w:p>
+    <w:p>
+      <w:pPr>
+        <w:pStyle w:val="NoSpacing"/>
+        <w:ind w:left="720"/>
         <w:rPr>
           <w:rFonts w:ascii="Courier New" w:hAnsi="Courier New" w:cs="Courier New"/>
           <w:sz w:val="18"/>
           <w:szCs w:val="28"/>
         </w:rPr>
-        <w:t xml:space="preserve">        </w:t>
-      </w:r>
-    </w:p>
-    <w:p>
-      <w:pPr>
-        <w:pStyle w:val="NoSpacing"/>
-        <w:ind w:left="720"/>
+      </w:pPr>
+      <w:r>
         <w:rPr>
           <w:rFonts w:ascii="Courier New" w:hAnsi="Courier New" w:cs="Courier New"/>
           <w:sz w:val="18"/>
           <w:szCs w:val="28"/>
         </w:rPr>
-      </w:pPr>
-      <w:r>
+        <w:t>&gt; Set *symmetry-pruning* = t</w:t>
+      </w:r>
+    </w:p>
+    <w:p>
+      <w:pPr>
+        <w:pStyle w:val="NoSpacing"/>
         <w:rPr>
           <w:rFonts w:ascii="Courier New" w:hAnsi="Courier New" w:cs="Courier New"/>
           <w:sz w:val="18"/>
           <w:szCs w:val="28"/>
         </w:rPr>
-        <w:t>&gt; *symmetry-pruning* = t</w:t>
-      </w:r>
+      </w:pPr>
     </w:p>
     <w:p>
       <w:pPr>
@@ -30502,69 +30438,70 @@
           <w:szCs w:val="28"/>
         </w:rPr>
       </w:pPr>
-    </w:p>
-    <w:p>
-      <w:pPr>
-        <w:pStyle w:val="NoSpacing"/>
+      <w:r>
         <w:rPr>
           <w:rFonts w:ascii="Courier New" w:hAnsi="Courier New" w:cs="Courier New"/>
           <w:sz w:val="18"/>
           <w:szCs w:val="28"/>
         </w:rPr>
-      </w:pPr>
+        <w:t xml:space="preserve">   4. Find Optimal Stat</w:t>
+      </w:r>
       <w:r>
         <w:rPr>
           <w:rFonts w:ascii="Courier New" w:hAnsi="Courier New" w:cs="Courier New"/>
           <w:sz w:val="18"/>
           <w:szCs w:val="28"/>
         </w:rPr>
-        <w:t xml:space="preserve">   4. Find Optimal Stat</w:t>
-      </w:r>
-      <w:r>
+        <w:t>e</w:t>
+      </w:r>
+    </w:p>
+    <w:p>
+      <w:pPr>
+        <w:pStyle w:val="NoSpacing"/>
         <w:rPr>
           <w:rFonts w:ascii="Courier New" w:hAnsi="Courier New" w:cs="Courier New"/>
           <w:sz w:val="18"/>
           <w:szCs w:val="28"/>
         </w:rPr>
-        <w:t>e</w:t>
-      </w:r>
-    </w:p>
-    <w:p>
-      <w:pPr>
-        <w:pStyle w:val="NoSpacing"/>
+      </w:pPr>
+      <w:r>
         <w:rPr>
           <w:rFonts w:ascii="Courier New" w:hAnsi="Courier New" w:cs="Courier New"/>
           <w:sz w:val="18"/>
           <w:szCs w:val="28"/>
         </w:rPr>
-      </w:pPr>
-      <w:r>
+        <w:t xml:space="preserve">      </w:t>
+      </w:r>
+    </w:p>
+    <w:p>
+      <w:pPr>
+        <w:pStyle w:val="NoSpacing"/>
+        <w:ind w:left="720"/>
         <w:rPr>
           <w:rFonts w:ascii="Courier New" w:hAnsi="Courier New" w:cs="Courier New"/>
           <w:sz w:val="18"/>
           <w:szCs w:val="28"/>
         </w:rPr>
-        <w:t xml:space="preserve">      </w:t>
-      </w:r>
-    </w:p>
-    <w:p>
-      <w:pPr>
-        <w:pStyle w:val="NoSpacing"/>
-        <w:ind w:left="720"/>
+      </w:pPr>
+      <w:r>
         <w:rPr>
           <w:rFonts w:ascii="Courier New" w:hAnsi="Courier New" w:cs="Courier New"/>
           <w:sz w:val="18"/>
           <w:szCs w:val="28"/>
         </w:rPr>
-      </w:pPr>
-      <w:r>
+        <w:lastRenderedPageBreak/>
+        <w:t>Use these options when you want the best state according to an objective function defined in the problem specification.</w:t>
+      </w:r>
+    </w:p>
+    <w:p>
+      <w:pPr>
+        <w:pStyle w:val="NoSpacing"/>
         <w:rPr>
           <w:rFonts w:ascii="Courier New" w:hAnsi="Courier New" w:cs="Courier New"/>
           <w:sz w:val="18"/>
           <w:szCs w:val="28"/>
         </w:rPr>
-        <w:t>Use these options when you want the best state according to an objective function defined in the problem specification.</w:t>
-      </w:r>
+      </w:pPr>
     </w:p>
     <w:p>
       <w:pPr>
@@ -30575,59 +30512,57 @@
           <w:szCs w:val="28"/>
         </w:rPr>
       </w:pPr>
-    </w:p>
-    <w:p>
-      <w:pPr>
-        <w:pStyle w:val="NoSpacing"/>
+      <w:r>
         <w:rPr>
           <w:rFonts w:ascii="Courier New" w:hAnsi="Courier New" w:cs="Courier New"/>
           <w:sz w:val="18"/>
           <w:szCs w:val="28"/>
         </w:rPr>
-      </w:pPr>
-      <w:r>
+        <w:t xml:space="preserve">      a. Minimum Value</w:t>
+      </w:r>
+    </w:p>
+    <w:p>
+      <w:pPr>
+        <w:pStyle w:val="NoSpacing"/>
         <w:rPr>
           <w:rFonts w:ascii="Courier New" w:hAnsi="Courier New" w:cs="Courier New"/>
           <w:sz w:val="18"/>
           <w:szCs w:val="28"/>
         </w:rPr>
-        <w:t xml:space="preserve">      a. Minimum Value</w:t>
-      </w:r>
-    </w:p>
-    <w:p>
-      <w:pPr>
-        <w:pStyle w:val="NoSpacing"/>
+      </w:pPr>
+      <w:r>
         <w:rPr>
           <w:rFonts w:ascii="Courier New" w:hAnsi="Courier New" w:cs="Courier New"/>
           <w:sz w:val="18"/>
           <w:szCs w:val="28"/>
         </w:rPr>
-      </w:pPr>
-      <w:r>
+        <w:t xml:space="preserve">        </w:t>
+      </w:r>
+    </w:p>
+    <w:p>
+      <w:pPr>
+        <w:pStyle w:val="NoSpacing"/>
         <w:rPr>
           <w:rFonts w:ascii="Courier New" w:hAnsi="Courier New" w:cs="Courier New"/>
           <w:sz w:val="18"/>
           <w:szCs w:val="28"/>
         </w:rPr>
-        <w:t xml:space="preserve">        </w:t>
-      </w:r>
-    </w:p>
-    <w:p>
-      <w:pPr>
-        <w:pStyle w:val="NoSpacing"/>
+      </w:pPr>
+      <w:r>
         <w:rPr>
           <w:rFonts w:ascii="Courier New" w:hAnsi="Courier New" w:cs="Courier New"/>
           <w:sz w:val="18"/>
           <w:szCs w:val="28"/>
         </w:rPr>
-      </w:pPr>
+        <w:t xml:space="preserve">         Finds </w:t>
+      </w:r>
       <w:r>
         <w:rPr>
           <w:rFonts w:ascii="Courier New" w:hAnsi="Courier New" w:cs="Courier New"/>
           <w:sz w:val="18"/>
           <w:szCs w:val="28"/>
         </w:rPr>
-        <w:t xml:space="preserve">         Finds </w:t>
+        <w:t>a</w:t>
       </w:r>
       <w:r>
         <w:rPr>
@@ -30635,51 +30570,43 @@
           <w:sz w:val="18"/>
           <w:szCs w:val="28"/>
         </w:rPr>
-        <w:t>a</w:t>
-      </w:r>
-      <w:r>
+        <w:t xml:space="preserve"> state with the lowest objective value.</w:t>
+      </w:r>
+    </w:p>
+    <w:p>
+      <w:pPr>
+        <w:pStyle w:val="NoSpacing"/>
         <w:rPr>
           <w:rFonts w:ascii="Courier New" w:hAnsi="Courier New" w:cs="Courier New"/>
           <w:sz w:val="18"/>
           <w:szCs w:val="28"/>
         </w:rPr>
-        <w:t xml:space="preserve"> state with the lowest objective value.</w:t>
-      </w:r>
-    </w:p>
-    <w:p>
-      <w:pPr>
-        <w:pStyle w:val="NoSpacing"/>
+      </w:pPr>
+      <w:r>
         <w:rPr>
           <w:rFonts w:ascii="Courier New" w:hAnsi="Courier New" w:cs="Courier New"/>
           <w:sz w:val="18"/>
           <w:szCs w:val="28"/>
         </w:rPr>
-      </w:pPr>
-      <w:r>
+        <w:t xml:space="preserve">        </w:t>
+      </w:r>
+    </w:p>
+    <w:p>
+      <w:pPr>
+        <w:pStyle w:val="NoSpacing"/>
         <w:rPr>
           <w:rFonts w:ascii="Courier New" w:hAnsi="Courier New" w:cs="Courier New"/>
           <w:sz w:val="18"/>
           <w:szCs w:val="28"/>
         </w:rPr>
-        <w:t xml:space="preserve">        </w:t>
-      </w:r>
-    </w:p>
-    <w:p>
-      <w:pPr>
-        <w:pStyle w:val="NoSpacing"/>
+      </w:pPr>
+      <w:r>
         <w:rPr>
           <w:rFonts w:ascii="Courier New" w:hAnsi="Courier New" w:cs="Courier New"/>
           <w:sz w:val="18"/>
           <w:szCs w:val="28"/>
         </w:rPr>
-      </w:pPr>
-      <w:r>
-        <w:rPr>
-          <w:rFonts w:ascii="Courier New" w:hAnsi="Courier New" w:cs="Courier New"/>
-          <w:sz w:val="18"/>
-          <w:szCs w:val="28"/>
-        </w:rPr>
-        <w:t xml:space="preserve">         &gt; *solution-type* = min-value</w:t>
+        <w:t xml:space="preserve">         &gt; Set *solution-type* = min-value</w:t>
       </w:r>
     </w:p>
     <w:p>
@@ -31218,7 +31145,6 @@
           <w:b/>
           <w:bCs/>
         </w:rPr>
-        <w:lastRenderedPageBreak/>
         <w:t>Combine pruning options.</w:t>
       </w:r>
       <w:r>
@@ -31241,6 +31167,7 @@
           <w:b/>
           <w:bCs/>
         </w:rPr>
+        <w:lastRenderedPageBreak/>
         <w:t>Watch for path explosion.</w:t>
       </w:r>
       <w:r>
@@ -31380,23 +31307,20 @@
         <w:t>.</w:t>
       </w:r>
       <w:r>
-        <w:t xml:space="preserve">  (But </w:t>
-      </w:r>
+        <w:t xml:space="preserve">  (But note that recent updates to the parallel algorithm to increase thread safety have significantly reduced its performance.)</w:t>
+      </w:r>
+    </w:p>
+    <w:p>
+      <w:pPr>
+        <w:pStyle w:val="NoSpacing"/>
+      </w:pPr>
+    </w:p>
+    <w:p>
+      <w:pPr>
+        <w:pStyle w:val="NoSpacing"/>
+      </w:pPr>
       <w:r>
         <w:lastRenderedPageBreak/>
-        <w:t>note that recent updates to the parallel algorithm to increase thread safety have significantly reduced its performance.)</w:t>
-      </w:r>
-    </w:p>
-    <w:p>
-      <w:pPr>
-        <w:pStyle w:val="NoSpacing"/>
-      </w:pPr>
-    </w:p>
-    <w:p>
-      <w:pPr>
-        <w:pStyle w:val="NoSpacing"/>
-      </w:pPr>
-      <w:r>
         <w:t xml:space="preserve">Parallel processing probably works best when using a tree (as opposed to a graph) search, because </w:t>
       </w:r>
       <w:r>
@@ -31511,11 +31435,14 @@
         <w:t xml:space="preserve"> the </w:t>
       </w:r>
       <w:r>
+        <w:t xml:space="preserve">shortest unexplored </w:t>
+      </w:r>
+      <w:r>
+        <w:t xml:space="preserve">linear path back to the start state.  Subsequent state expansions in the subproblem will continue from the last state in this path.  This strategy (ie, top linear split) seems to work well for </w:t>
+      </w:r>
+      <w:r>
         <w:lastRenderedPageBreak/>
-        <w:t xml:space="preserve">shortest unexplored </w:t>
-      </w:r>
-      <w:r>
-        <w:t xml:space="preserve">linear path back to the start state.  Subsequent state expansions in the subproblem will continue from the last state in this path.  This strategy (ie, top linear split) seems to work well for most problems, although massively parallel simulations have shown that a more complex multi-level strategy (ie, stack split) is generally more efficient overall.  In Wouldwork the best parallel speedups seem to correlate with tree (as opposed to graph) search.  But note that too many threads, or even </w:t>
+        <w:t xml:space="preserve">most problems, although massively parallel simulations have shown that a more complex multi-level strategy (ie, stack split) is generally more efficient overall.  In Wouldwork the best parallel speedups seem to correlate with tree (as opposed to graph) search.  But note that too many threads, or even </w:t>
       </w:r>
       <w:r>
         <w:rPr>
@@ -31607,14 +31534,7 @@
         <w:rPr>
           <w:sz w:val="24"/>
         </w:rPr>
-        <w:t xml:space="preserve"> - the ability </w:t>
-      </w:r>
-      <w:r>
-        <w:rPr>
-          <w:sz w:val="24"/>
-        </w:rPr>
-        <w:lastRenderedPageBreak/>
-        <w:t>to solve a sequence of subgoals where each search continues from the final state of the previous search.</w:t>
+        <w:t xml:space="preserve"> - the ability to solve a sequence of subgoals where each search continues from the final state of the previous search.</w:t>
       </w:r>
     </w:p>
     <w:p>
@@ -31654,6 +31574,7 @@
         <w:rPr>
           <w:sz w:val="24"/>
         </w:rPr>
+        <w:lastRenderedPageBreak/>
         <w:t>Specify the first subgoal in your problem specification file using (define-goal ...)</w:t>
       </w:r>
     </w:p>
@@ -31862,8 +31783,15 @@
           <w:rFonts w:cstheme="minorHAnsi"/>
           <w:sz w:val="24"/>
         </w:rPr>
+        <w:t xml:space="preserve">The heuristic function analyses a state, and returns a real number indicating how promising that state is for leading to a solution.  A lower value indicates a more promising state than a higher value.  In general, a lower value may correspond to a state which is closer to a </w:t>
+      </w:r>
+      <w:r>
+        <w:rPr>
+          <w:rFonts w:cstheme="minorHAnsi"/>
+          <w:sz w:val="24"/>
+        </w:rPr>
         <w:lastRenderedPageBreak/>
-        <w:t>The heuristic function analyses a state, and returns a real number indicating how promising that state is for leading to a solution.  A lower value indicates a more promising state than a higher value.  In general, a lower value may correspond to a state which is closer to a goal.  But not always.  It is probably better to think of the heuristic value as an indicator of how likely a state is to eventually lead to a solution—ie, its promise.</w:t>
+        <w:t>goal.  But not always.  It is probably better to think of the heuristic value as an indicator of how likely a state is to eventually lead to a solution—ie, its promise.</w:t>
       </w:r>
     </w:p>
     <w:p>
@@ -32185,7 +32113,14 @@
         <w:rPr>
           <w:sz w:val="24"/>
         </w:rPr>
-        <w:t>, calculate the current value in the relevant action rule, and assign it to the special fluent variable named $objective-value</w:t>
+        <w:t xml:space="preserve">, calculate the current value in the relevant action rule, and </w:t>
+      </w:r>
+      <w:r>
+        <w:rPr>
+          <w:sz w:val="24"/>
+        </w:rPr>
+        <w:lastRenderedPageBreak/>
+        <w:t>assign it to the special fluent variable named $objective-value</w:t>
       </w:r>
       <w:r>
         <w:rPr>
@@ -32456,63 +32391,56 @@
           <w:sz w:val="24"/>
           <w:szCs w:val="24"/>
         </w:rPr>
-        <w:t xml:space="preserve"> finding a value for each of a number of variables that together satisfy a number of </w:t>
+        <w:t xml:space="preserve"> finding a value for each of a number of variables that together satisfy a number of constraints.</w:t>
       </w:r>
       <w:r>
         <w:rPr>
           <w:sz w:val="24"/>
           <w:szCs w:val="24"/>
         </w:rPr>
-        <w:lastRenderedPageBreak/>
-        <w:t>constraints.</w:t>
+        <w:t xml:space="preserve">  One popular type of CSP are logic problems, </w:t>
       </w:r>
       <w:r>
         <w:rPr>
           <w:sz w:val="24"/>
           <w:szCs w:val="24"/>
         </w:rPr>
-        <w:t xml:space="preserve">  One popular type of CSP are logic problems, </w:t>
+        <w:t xml:space="preserve">as illustrated in the file </w:t>
       </w:r>
       <w:r>
         <w:rPr>
           <w:sz w:val="24"/>
           <w:szCs w:val="24"/>
         </w:rPr>
-        <w:t xml:space="preserve">as illustrated in the file </w:t>
+        <w:t>problem-</w:t>
       </w:r>
       <w:r>
         <w:rPr>
           <w:sz w:val="24"/>
           <w:szCs w:val="24"/>
         </w:rPr>
-        <w:t>problem-</w:t>
+        <w:t>captjohn.lisp</w:t>
       </w:r>
       <w:r>
         <w:rPr>
           <w:sz w:val="24"/>
           <w:szCs w:val="24"/>
         </w:rPr>
-        <w:t>captjohn.lisp</w:t>
+        <w:t>, where there are multiple constraints on the relative positions of objects</w:t>
       </w:r>
       <w:r>
         <w:rPr>
           <w:sz w:val="24"/>
           <w:szCs w:val="24"/>
         </w:rPr>
-        <w:t>, where there are multiple constraints on the relative positions of objects</w:t>
+        <w:t xml:space="preserve">.  The n-queens problem (eg, </w:t>
       </w:r>
       <w:r>
         <w:rPr>
           <w:sz w:val="24"/>
           <w:szCs w:val="24"/>
         </w:rPr>
-        <w:t xml:space="preserve">.  The n-queens problem (eg, </w:t>
-      </w:r>
-      <w:r>
-        <w:rPr>
-          <w:sz w:val="24"/>
-          <w:szCs w:val="24"/>
-        </w:rPr>
+        <w:lastRenderedPageBreak/>
         <w:t>problem-</w:t>
       </w:r>
       <w:r>
@@ -32810,6 +32738,7 @@
         <w:spacing w:after="0" w:line="240" w:lineRule="auto"/>
       </w:pPr>
       <w:r>
+        <w:lastRenderedPageBreak/>
         <w:t xml:space="preserve">When enabled, Wouldwork automatically analyzes your problem before search begins and identifies </w:t>
       </w:r>
       <w:r>
@@ -32980,24 +32909,21 @@
         <w:spacing w:after="0" w:line="240" w:lineRule="auto"/>
       </w:pPr>
       <w:r>
-        <w:t xml:space="preserve">When using *solution-type* = every, be aware that symmetry pruning will eliminate solutions that differ only by which symmetric objects are used. If </w:t>
-      </w:r>
+        <w:t>When using *solution-type* = every, be aware that symmetry pruning will eliminate solutions that differ only by which symmetric objects are used. If you need to enumerate all such variations, disable symmetry pruning for that search.</w:t>
+      </w:r>
+    </w:p>
+    <w:p>
+      <w:pPr>
+        <w:spacing w:after="0" w:line="240" w:lineRule="auto"/>
+      </w:pPr>
+    </w:p>
+    <w:p>
+      <w:pPr>
+        <w:pStyle w:val="Heading2"/>
+      </w:pPr>
+      <w:bookmarkStart w:id="63" w:name="_Toc206658688"/>
       <w:r>
         <w:lastRenderedPageBreak/>
-        <w:t>you need to enumerate all such variations, disable symmetry pruning for that search.</w:t>
-      </w:r>
-    </w:p>
-    <w:p>
-      <w:pPr>
-        <w:spacing w:after="0" w:line="240" w:lineRule="auto"/>
-      </w:pPr>
-    </w:p>
-    <w:p>
-      <w:pPr>
-        <w:pStyle w:val="Heading2"/>
-      </w:pPr>
-      <w:bookmarkStart w:id="63" w:name="_Toc206658688"/>
-      <w:r>
         <w:t>Searching with Macro Operators</w:t>
       </w:r>
       <w:bookmarkEnd w:id="63"/>
@@ -33201,11 +33127,7 @@
         <w:t xml:space="preserve"> target problem, then the utility program can extract all possible macros that lead to those solutions.</w:t>
       </w:r>
       <w:r>
-        <w:t xml:space="preserve">  The arguments to freq are the macros of the desired length.  For example, (freq 2 3) will return all macros of length </w:t>
-      </w:r>
-      <w:r>
-        <w:lastRenderedPageBreak/>
-        <w:t>2 and length 3, ordered by frequency</w:t>
+        <w:t xml:space="preserve">  The arguments to freq are the macros of the desired length.  For example, (freq 2 3) will return all macros of length 2 and length 3, ordered by frequency</w:t>
       </w:r>
       <w:r>
         <w:t>.  The most frequently found macro actions are the ones most likely to be of use in the final problem specification.  But intuitions can be deceptive.</w:t>
@@ -33493,39 +33415,32 @@
           <w:rFonts w:cstheme="minorHAnsi"/>
           <w:sz w:val="24"/>
         </w:rPr>
-        <w:t xml:space="preserve"> that hopefully matches one (or more) of the encoded backward states.  Wouldwork then joins together the </w:t>
-      </w:r>
-      <w:r>
+        <w:t xml:space="preserve"> that hopefully matches one (or more) of the encoded backward states.  Wouldwork then joins together the solutions from the forward and backward directions to derive the net solutions.</w:t>
+      </w:r>
+    </w:p>
+    <w:p>
+      <w:pPr>
+        <w:spacing w:after="0" w:line="240" w:lineRule="auto"/>
         <w:rPr>
           <w:rFonts w:cstheme="minorHAnsi"/>
           <w:sz w:val="24"/>
         </w:rPr>
+      </w:pPr>
+    </w:p>
+    <w:p>
+      <w:pPr>
+        <w:spacing w:after="0" w:line="240" w:lineRule="auto"/>
+        <w:rPr>
+          <w:rFonts w:cstheme="minorHAnsi"/>
+          <w:sz w:val="24"/>
+        </w:rPr>
+      </w:pPr>
+      <w:r>
+        <w:rPr>
+          <w:rFonts w:cstheme="minorHAnsi"/>
+          <w:sz w:val="24"/>
+        </w:rPr>
         <w:lastRenderedPageBreak/>
-        <w:t>solutions from the forward and backward directions to derive the net solutions.</w:t>
-      </w:r>
-    </w:p>
-    <w:p>
-      <w:pPr>
-        <w:spacing w:after="0" w:line="240" w:lineRule="auto"/>
-        <w:rPr>
-          <w:rFonts w:cstheme="minorHAnsi"/>
-          <w:sz w:val="24"/>
-        </w:rPr>
-      </w:pPr>
-    </w:p>
-    <w:p>
-      <w:pPr>
-        <w:spacing w:after="0" w:line="240" w:lineRule="auto"/>
-        <w:rPr>
-          <w:rFonts w:cstheme="minorHAnsi"/>
-          <w:sz w:val="24"/>
-        </w:rPr>
-      </w:pPr>
-      <w:r>
-        <w:rPr>
-          <w:rFonts w:cstheme="minorHAnsi"/>
-          <w:sz w:val="24"/>
-        </w:rPr>
         <w:t>The following outlines in more detail the procedure for setting up and running a bi-directional search:</w:t>
       </w:r>
     </w:p>
@@ -33768,7 +33683,6 @@
           <w:rFonts w:cstheme="minorHAnsi"/>
           <w:sz w:val="24"/>
         </w:rPr>
-        <w:lastRenderedPageBreak/>
         <w:t xml:space="preserve">Add a standard </w:t>
       </w:r>
       <w:r>
@@ -33799,7 +33713,15 @@
           <w:rFonts w:cstheme="minorHAnsi"/>
           <w:sz w:val="24"/>
         </w:rPr>
-        <w:t xml:space="preserve"> to the backward search specification—ie, (defun encode-state (propositions) …), which takes a list of propositions and returns a coded representation of those propositions.  The propositions are the list of current (dynamic) propositions defining any state.  The encode-state function must return a </w:t>
+        <w:t xml:space="preserve"> to the backward search specification—ie, (defun encode-state (propositions) …), which takes a list of propositions and returns </w:t>
+      </w:r>
+      <w:r>
+        <w:rPr>
+          <w:rFonts w:cstheme="minorHAnsi"/>
+          <w:sz w:val="24"/>
+        </w:rPr>
+        <w:lastRenderedPageBreak/>
+        <w:t xml:space="preserve">a coded representation of those propositions.  The propositions are the list of current (dynamic) propositions defining any state.  The encode-state function must return a </w:t>
       </w:r>
       <w:r>
         <w:rPr>
@@ -34068,6 +33990,380 @@
     </w:p>
     <w:p>
       <w:pPr>
+        <w:pStyle w:val="NoSpacing"/>
+      </w:pPr>
+    </w:p>
+    <w:p>
+      <w:pPr>
+        <w:pStyle w:val="Heading2"/>
+      </w:pPr>
+      <w:r>
+        <w:lastRenderedPageBreak/>
+        <w:t>Meet-In-The-Middle Search</w:t>
+      </w:r>
+    </w:p>
+    <w:p>
+      <w:pPr>
+        <w:pStyle w:val="NoSpacing"/>
+      </w:pPr>
+    </w:p>
+    <w:p>
+      <w:pPr>
+        <w:pStyle w:val="NoSpacing"/>
+      </w:pPr>
+      <w:r>
+        <w:t xml:space="preserve">Some planning problems resist direct solution.  A forward search from the start state may face a combinatorial explosion where no heuristic or intermediate subgoal is powerful enough to guide the solver toward the goal within a reasonable depth cutoff.  When standard techniques fail, a meet-in-the-middle search strategy offers an alternative Wouldwork problem-solving capability. </w:t>
+      </w:r>
+      <w:r>
+        <w:t xml:space="preserve"> </w:t>
+      </w:r>
+      <w:r>
+        <w:t xml:space="preserve">But the user has to supplement the usual problem specification with an additional section that tells Wouldwork's enumerator how to generate candidate states backward from the goal.  </w:t>
+      </w:r>
+    </w:p>
+    <w:p>
+      <w:pPr>
+        <w:pStyle w:val="NoSpacing"/>
+      </w:pPr>
+    </w:p>
+    <w:p>
+      <w:pPr>
+        <w:pStyle w:val="NoSpacing"/>
+      </w:pPr>
+      <w:r>
+        <w:t>Instead of searching forward from start to goal, the enumerator works backward from the goal to a set of intermediate states. It initially enumerates all states that could satisfy the goal condition, then it expands those states backward through layers of predecessor states, building a comprehensive set of intermediate states</w:t>
+      </w:r>
+      <w:r>
+        <w:t>,</w:t>
+      </w:r>
+      <w:r>
+        <w:t xml:space="preserve"> </w:t>
+      </w:r>
+      <w:r>
+        <w:t>potentially</w:t>
+      </w:r>
+      <w:r>
+        <w:t xml:space="preserve"> reachable from the start state.  The forward solver then only needs to reach any state in this reachable set, a typically much shallower search.  The full solution then consists of stitching together the forward + backward paths to the goal.</w:t>
+      </w:r>
+    </w:p>
+    <w:p>
+      <w:pPr>
+        <w:pStyle w:val="NoSpacing"/>
+      </w:pPr>
+    </w:p>
+    <w:p>
+      <w:pPr>
+        <w:pStyle w:val="NoSpacing"/>
+      </w:pPr>
+      <w:r>
+        <w:t>But note that either forward search or backward enumeration can still be intractable.  Experimentation is the best way to find out if a good meeting point can be found.  Look at the final section of problem-corner.lisp for an example of how to specify enumerator requirements.</w:t>
+      </w:r>
+    </w:p>
+    <w:p>
+      <w:pPr>
+        <w:pStyle w:val="NoSpacing"/>
+      </w:pPr>
+    </w:p>
+    <w:p>
+      <w:pPr>
+        <w:pStyle w:val="NoSpacing"/>
+      </w:pPr>
+      <w:r>
+        <w:t>Base vs Derived Relations</w:t>
+      </w:r>
+    </w:p>
+    <w:p>
+      <w:pPr>
+        <w:pStyle w:val="NoSpacing"/>
+      </w:pPr>
+    </w:p>
+    <w:p>
+      <w:pPr>
+        <w:pStyle w:val="NoSpacing"/>
+      </w:pPr>
+      <w:r>
+        <w:t xml:space="preserve">Much of the user's input to the enumerator involves telling the enumerator how to prune the exponentially explosive backward generation of states.  Dynamic relations (specified with define-dynamic-relations) normally consist of two types: base relations and derived relations.  A base relation is a dynamic relation whose argument values determine a complete problem state. For example, a </w:t>
+      </w:r>
+      <w:r>
+        <w:lastRenderedPageBreak/>
+        <w:t xml:space="preserve">typical base relation is the location of objects like (on object plate), where being on a (pressure) plate opens a gate. But (open gate), indicating that a gate is open, is a derived relation, since it can be derived from the status of an on relation.  If an object is on a plate, then </w:t>
+      </w:r>
+      <w:r>
+        <w:t xml:space="preserve">it will open </w:t>
+      </w:r>
+      <w:r>
+        <w:t>a gate</w:t>
+      </w:r>
+      <w:r>
+        <w:t>.</w:t>
+      </w:r>
+      <w:r>
+        <w:t xml:space="preserve">  If the enumerator knows all of the base relations, it can infer all the derived relations. Therefore, specifying only the base relations for a partial state is sufficient for deriving the complete state--eg, (on object1 plate1) means (open gate1) should also be part of the state and will be automatically</w:t>
+      </w:r>
+      <w:r>
+        <w:t xml:space="preserve"> added</w:t>
+      </w:r>
+      <w:r>
+        <w:t>.</w:t>
+      </w:r>
+    </w:p>
+    <w:p>
+      <w:pPr>
+        <w:pStyle w:val="NoSpacing"/>
+      </w:pPr>
+    </w:p>
+    <w:p>
+      <w:pPr>
+        <w:pStyle w:val="NoSpacing"/>
+      </w:pPr>
+      <w:r>
+        <w:t>Method</w:t>
+      </w:r>
+    </w:p>
+    <w:p>
+      <w:pPr>
+        <w:pStyle w:val="NoSpacing"/>
+      </w:pPr>
+    </w:p>
+    <w:p>
+      <w:pPr>
+        <w:pStyle w:val="NoSpacing"/>
+      </w:pPr>
+      <w:r>
+        <w:t>The enumerator uses a CSP (constraint satisfaction problem) technique to systematically generate candidate base states.  It requires the user declare all of the base relations of the problem, including any known base relation constraints that can prune the CSP search.</w:t>
+      </w:r>
+    </w:p>
+    <w:p>
+      <w:pPr>
+        <w:pStyle w:val="NoSpacing"/>
+      </w:pPr>
+    </w:p>
+    <w:p>
+      <w:pPr>
+        <w:pStyle w:val="NoSpacing"/>
+      </w:pPr>
+      <w:r>
+        <w:t>The enumerator first converts these base-relation declarations into a sequence of CSP actions. It then uses the Wouldwork solver with *problem-type* = CSP to search through all possible argument assignments of the base relations to create base states, pruning heavily as it goes.  Finally, it adds all derived relations to each base state and tests against the goal condition, throwing out any that do not satisfy the goal.</w:t>
+      </w:r>
+    </w:p>
+    <w:p>
+      <w:pPr>
+        <w:pStyle w:val="NoSpacing"/>
+      </w:pPr>
+    </w:p>
+    <w:p>
+      <w:pPr>
+        <w:pStyle w:val="NoSpacing"/>
+      </w:pPr>
+      <w:r>
+        <w:t>Once the candidate goal states are available, the backward enumeration to candidate predecessor states can begin.  Each backward predecessor level makes use of the same CSP process to develop all of the candidate predecessor states that can satisfy the goal.  The user controls how many layers deep the backward search goes.</w:t>
+      </w:r>
+    </w:p>
+    <w:p>
+      <w:pPr>
+        <w:pStyle w:val="NoSpacing"/>
+      </w:pPr>
+    </w:p>
+    <w:p>
+      <w:pPr>
+        <w:pStyle w:val="NoSpacing"/>
+      </w:pPr>
+    </w:p>
+    <w:p>
+      <w:pPr>
+        <w:pStyle w:val="NoSpacing"/>
+      </w:pPr>
+    </w:p>
+    <w:p>
+      <w:pPr>
+        <w:pStyle w:val="NoSpacing"/>
+      </w:pPr>
+    </w:p>
+    <w:p>
+      <w:pPr>
+        <w:pStyle w:val="NoSpacing"/>
+      </w:pPr>
+      <w:r>
+        <w:lastRenderedPageBreak/>
+        <w:t>Specification</w:t>
+      </w:r>
+    </w:p>
+    <w:p>
+      <w:pPr>
+        <w:pStyle w:val="NoSpacing"/>
+      </w:pPr>
+    </w:p>
+    <w:p>
+      <w:pPr>
+        <w:pStyle w:val="NoSpacing"/>
+      </w:pPr>
+      <w:r>
+        <w:t xml:space="preserve">To use the enumerator, the user must include certain declarations in the problem spec.  These declarations are placed in the problem file, typically at the end, after the standard define-action, define-query,  define-update, and define-goal forms.  Three declaration forms are available: </w:t>
+      </w:r>
+      <w:r>
+        <w:t xml:space="preserve"> </w:t>
+      </w:r>
+      <w:r>
+        <w:t>define-base-relation (required), define-goal-filter (optional), and the state-feasible? query (optional).  Define-base-relation tells the enumerator how to generate and prune potential base relations; define-goal-filter offers extra pruning of goal states; and state-feasible? should prune any enumerated state that is not reachable from the start state.</w:t>
+      </w:r>
+    </w:p>
+    <w:p>
+      <w:pPr>
+        <w:pStyle w:val="NoSpacing"/>
+      </w:pPr>
+    </w:p>
+    <w:p>
+      <w:pPr>
+        <w:pStyle w:val="NoSpacing"/>
+      </w:pPr>
+      <w:r>
+        <w:t>In addition, the problem spec actions must be organized properly to use the enumerator.  Actions must assert only base relations, and then call propagate-changes! (a standard update function) that will add all derived relations to the current state.  The enumerator processes base relations in the order they are declared, so relations that constrain others should be declared first for efficiency.</w:t>
+      </w:r>
+    </w:p>
+    <w:p>
+      <w:pPr>
+        <w:pStyle w:val="NoSpacing"/>
+      </w:pPr>
+    </w:p>
+    <w:p>
+      <w:pPr>
+        <w:pStyle w:val="NoSpacing"/>
+      </w:pPr>
+      <w:r>
+        <w:t>Workflow</w:t>
+      </w:r>
+    </w:p>
+    <w:p>
+      <w:pPr>
+        <w:pStyle w:val="NoSpacing"/>
+      </w:pPr>
+    </w:p>
+    <w:p>
+      <w:pPr>
+        <w:pStyle w:val="NoSpacing"/>
+      </w:pPr>
+      <w:r>
+        <w:t>The enumerator workflow normally consists of several basic steps, each invoked from the REPL.  Each step builds on the results of the previous step:</w:t>
+      </w:r>
+    </w:p>
+    <w:p>
+      <w:pPr>
+        <w:pStyle w:val="NoSpacing"/>
+      </w:pPr>
+    </w:p>
+    <w:p>
+      <w:pPr>
+        <w:pStyle w:val="NoSpacing"/>
+        <w:numPr>
+          <w:ilvl w:val="0"/>
+          <w:numId w:val="27"/>
+        </w:numPr>
+        <w:ind w:left="360"/>
+      </w:pPr>
+      <w:r>
+        <w:t>(progn (ql:quickload wouldwork) (in-package :ww)) - load Wouldwork.</w:t>
+      </w:r>
+    </w:p>
+    <w:p>
+      <w:pPr>
+        <w:pStyle w:val="NoSpacing"/>
+        <w:numPr>
+          <w:ilvl w:val="0"/>
+          <w:numId w:val="27"/>
+        </w:numPr>
+        <w:ind w:left="360"/>
+      </w:pPr>
+      <w:r>
+        <w:t>(stage &lt;problem-name&gt;) - load your problem into Wouldwork</w:t>
+      </w:r>
+    </w:p>
+    <w:p>
+      <w:pPr>
+        <w:pStyle w:val="NoSpacing"/>
+        <w:numPr>
+          <w:ilvl w:val="0"/>
+          <w:numId w:val="27"/>
+        </w:numPr>
+        <w:ind w:left="360"/>
+      </w:pPr>
+      <w:r>
+        <w:t>(find-goal-states) - enumerate all candidate goal states compatible with the problem goal</w:t>
+      </w:r>
+    </w:p>
+    <w:p>
+      <w:pPr>
+        <w:pStyle w:val="NoSpacing"/>
+        <w:numPr>
+          <w:ilvl w:val="0"/>
+          <w:numId w:val="27"/>
+        </w:numPr>
+        <w:ind w:left="360"/>
+      </w:pPr>
+      <w:r>
+        <w:t>(find-predecessors) - enumerate all predecessor states, one layer at a time</w:t>
+      </w:r>
+    </w:p>
+    <w:p>
+      <w:pPr>
+        <w:pStyle w:val="NoSpacing"/>
+        <w:ind w:left="720"/>
+      </w:pPr>
+      <w:r>
+        <w:t>-after backward enumeration for a layer completes, answer yes to continue, or no to stop generating backward layers</w:t>
+      </w:r>
+    </w:p>
+    <w:p>
+      <w:pPr>
+        <w:pStyle w:val="NoSpacing"/>
+        <w:ind w:left="360" w:firstLine="360"/>
+      </w:pPr>
+      <w:r>
+        <w:t>-enter Ctrl-C during a layer to prematurely exit that layer</w:t>
+      </w:r>
+    </w:p>
+    <w:p>
+      <w:pPr>
+        <w:pStyle w:val="NoSpacing"/>
+        <w:numPr>
+          <w:ilvl w:val="0"/>
+          <w:numId w:val="27"/>
+        </w:numPr>
+        <w:ind w:left="360"/>
+      </w:pPr>
+      <w:r>
+        <w:lastRenderedPageBreak/>
+        <w:t>(solve-meeting-point :depth-cutoff &lt;N&gt; :solution-type first) - forward search to the depth corresponding to the last backward layer from the goal</w:t>
+      </w:r>
+    </w:p>
+    <w:p>
+      <w:pPr>
+        <w:pStyle w:val="NoSpacing"/>
+        <w:numPr>
+          <w:ilvl w:val="0"/>
+          <w:numId w:val="27"/>
+        </w:numPr>
+        <w:ind w:left="360"/>
+      </w:pPr>
+      <w:r>
+        <w:t>Examine the final solution which patches the backward layers onto the forward path</w:t>
+      </w:r>
+    </w:p>
+    <w:p>
+      <w:pPr>
+        <w:pStyle w:val="NoSpacing"/>
+        <w:ind w:left="720"/>
+      </w:pPr>
+      <w:r>
+        <w:t>-review *solutions* and/or *unique-solutions* if more than one solution requested</w:t>
+      </w:r>
+    </w:p>
+    <w:p>
+      <w:pPr>
+        <w:pStyle w:val="NoSpacing"/>
+      </w:pPr>
+    </w:p>
+    <w:p>
+      <w:pPr>
         <w:pStyle w:val="Heading2"/>
       </w:pPr>
       <w:bookmarkStart w:id="65" w:name="_Toc206658690"/>
@@ -34292,7 +34588,11 @@
         <w:t>CLOSED</w:t>
       </w:r>
       <w:r>
-        <w:t xml:space="preserve"> whose f values were thus lowered and redirect to n, the pointers from all nodes whose f values were lowered. </w:t>
+        <w:t xml:space="preserve"> </w:t>
+      </w:r>
+      <w:r>
+        <w:lastRenderedPageBreak/>
+        <w:t>whose f values were thus lowered and redirect to n, the pointers from all nodes whose f values were lowered. </w:t>
       </w:r>
     </w:p>
     <w:p>
@@ -34322,11 +34622,7 @@
         <w:pStyle w:val="NoSpacing"/>
       </w:pPr>
       <w:r>
-        <w:t xml:space="preserve">Note that Wouldwork can perform either a depth-first or backtracking search using the same problem specification.  Backtracking search is more efficient when working with trees since it doesn’t copy states or </w:t>
-      </w:r>
-      <w:r>
-        <w:lastRenderedPageBreak/>
-        <w:t xml:space="preserve">maintain OPEN or CLOSED tables of states.  However, backtracking </w:t>
+        <w:t xml:space="preserve">Note that Wouldwork can perform either a depth-first or backtracking search using the same problem specification.  Backtracking search is more efficient when working with trees since it doesn’t copy states or maintain OPEN or CLOSED tables of states.  However, backtracking </w:t>
       </w:r>
       <w:r>
         <w:t>often will get lost if there are repeated states, so use depth-first with graphs.</w:t>
@@ -36067,7 +36363,7 @@
           <v:shape id="_x0000_i1028" type="#_x0000_t75" style="width:237pt;height:226.5pt" o:ole="">
             <v:imagedata r:id="rId15" o:title=""/>
           </v:shape>
-          <o:OLEObject Type="Embed" ProgID="Visio.Drawing.15" ShapeID="_x0000_i1028" DrawAspect="Content" ObjectID="_1832174752" r:id="rId16"/>
+          <o:OLEObject Type="Embed" ProgID="Visio.Drawing.15" ShapeID="_x0000_i1028" DrawAspect="Content" ObjectID="_1834210201" r:id="rId16"/>
         </w:object>
       </w:r>
     </w:p>
@@ -39017,7 +39313,7 @@
           <v:shape id="_x0000_i1029" type="#_x0000_t75" style="width:334.5pt;height:189pt" o:ole="">
             <v:imagedata r:id="rId23" o:title=""/>
           </v:shape>
-          <o:OLEObject Type="Embed" ProgID="Visio.Drawing.15" ShapeID="_x0000_i1029" DrawAspect="Content" ObjectID="_1832174753" r:id="rId24"/>
+          <o:OLEObject Type="Embed" ProgID="Visio.Drawing.15" ShapeID="_x0000_i1029" DrawAspect="Content" ObjectID="_1834210202" r:id="rId24"/>
         </w:object>
       </w:r>
     </w:p>
@@ -44618,7 +44914,7 @@
           <v:shape id="_x0000_i1030" type="#_x0000_t75" style="width:297.5pt;height:186pt" o:ole="">
             <v:imagedata r:id="rId29" o:title="" croptop="10508f" cropbottom="10508f" cropleft="9845f" cropright="14768f"/>
           </v:shape>
-          <o:OLEObject Type="Embed" ProgID="PowerPoint.Show.12" ShapeID="_x0000_i1030" DrawAspect="Content" ObjectID="_1832174754" r:id="rId30"/>
+          <o:OLEObject Type="Embed" ProgID="PowerPoint.Show.12" ShapeID="_x0000_i1030" DrawAspect="Content" ObjectID="_1834210203" r:id="rId30"/>
         </w:object>
       </w:r>
     </w:p>
@@ -59859,6 +60155,92 @@
     </w:lvl>
   </w:abstractNum>
   <w:abstractNum w:abstractNumId="11" w15:restartNumberingAfterBreak="0">
+    <w:nsid w:val="31C81090"/>
+    <w:multiLevelType w:val="hybridMultilevel"/>
+    <w:tmpl w:val="2AA4550A"/>
+    <w:lvl w:ilvl="0" w:tplc="0409000F">
+      <w:start w:val="1"/>
+      <w:numFmt w:val="decimal"/>
+      <w:lvlText w:val="%1."/>
+      <w:lvlJc w:val="left"/>
+      <w:pPr>
+        <w:ind w:left="720" w:hanging="360"/>
+      </w:pPr>
+    </w:lvl>
+    <w:lvl w:ilvl="1" w:tplc="04090019" w:tentative="1">
+      <w:start w:val="1"/>
+      <w:numFmt w:val="lowerLetter"/>
+      <w:lvlText w:val="%2."/>
+      <w:lvlJc w:val="left"/>
+      <w:pPr>
+        <w:ind w:left="1440" w:hanging="360"/>
+      </w:pPr>
+    </w:lvl>
+    <w:lvl w:ilvl="2" w:tplc="0409001B" w:tentative="1">
+      <w:start w:val="1"/>
+      <w:numFmt w:val="lowerRoman"/>
+      <w:lvlText w:val="%3."/>
+      <w:lvlJc w:val="right"/>
+      <w:pPr>
+        <w:ind w:left="2160" w:hanging="180"/>
+      </w:pPr>
+    </w:lvl>
+    <w:lvl w:ilvl="3" w:tplc="0409000F" w:tentative="1">
+      <w:start w:val="1"/>
+      <w:numFmt w:val="decimal"/>
+      <w:lvlText w:val="%4."/>
+      <w:lvlJc w:val="left"/>
+      <w:pPr>
+        <w:ind w:left="2880" w:hanging="360"/>
+      </w:pPr>
+    </w:lvl>
+    <w:lvl w:ilvl="4" w:tplc="04090019" w:tentative="1">
+      <w:start w:val="1"/>
+      <w:numFmt w:val="lowerLetter"/>
+      <w:lvlText w:val="%5."/>
+      <w:lvlJc w:val="left"/>
+      <w:pPr>
+        <w:ind w:left="3600" w:hanging="360"/>
+      </w:pPr>
+    </w:lvl>
+    <w:lvl w:ilvl="5" w:tplc="0409001B" w:tentative="1">
+      <w:start w:val="1"/>
+      <w:numFmt w:val="lowerRoman"/>
+      <w:lvlText w:val="%6."/>
+      <w:lvlJc w:val="right"/>
+      <w:pPr>
+        <w:ind w:left="4320" w:hanging="180"/>
+      </w:pPr>
+    </w:lvl>
+    <w:lvl w:ilvl="6" w:tplc="0409000F" w:tentative="1">
+      <w:start w:val="1"/>
+      <w:numFmt w:val="decimal"/>
+      <w:lvlText w:val="%7."/>
+      <w:lvlJc w:val="left"/>
+      <w:pPr>
+        <w:ind w:left="5040" w:hanging="360"/>
+      </w:pPr>
+    </w:lvl>
+    <w:lvl w:ilvl="7" w:tplc="04090019" w:tentative="1">
+      <w:start w:val="1"/>
+      <w:numFmt w:val="lowerLetter"/>
+      <w:lvlText w:val="%8."/>
+      <w:lvlJc w:val="left"/>
+      <w:pPr>
+        <w:ind w:left="5760" w:hanging="360"/>
+      </w:pPr>
+    </w:lvl>
+    <w:lvl w:ilvl="8" w:tplc="0409001B" w:tentative="1">
+      <w:start w:val="1"/>
+      <w:numFmt w:val="lowerRoman"/>
+      <w:lvlText w:val="%9."/>
+      <w:lvlJc w:val="right"/>
+      <w:pPr>
+        <w:ind w:left="6480" w:hanging="180"/>
+      </w:pPr>
+    </w:lvl>
+  </w:abstractNum>
+  <w:abstractNum w:abstractNumId="12" w15:restartNumberingAfterBreak="0">
     <w:nsid w:val="3F241704"/>
     <w:multiLevelType w:val="multilevel"/>
     <w:tmpl w:val="6FCEC38C"/>
@@ -60007,7 +60389,7 @@
       </w:rPr>
     </w:lvl>
   </w:abstractNum>
-  <w:abstractNum w:abstractNumId="12" w15:restartNumberingAfterBreak="0">
+  <w:abstractNum w:abstractNumId="13" w15:restartNumberingAfterBreak="0">
     <w:nsid w:val="3F5E4002"/>
     <w:multiLevelType w:val="hybridMultilevel"/>
     <w:tmpl w:val="90743D8E"/>
@@ -60096,7 +60478,96 @@
       </w:pPr>
     </w:lvl>
   </w:abstractNum>
-  <w:abstractNum w:abstractNumId="13" w15:restartNumberingAfterBreak="0">
+  <w:abstractNum w:abstractNumId="14" w15:restartNumberingAfterBreak="0">
+    <w:nsid w:val="41BF02F2"/>
+    <w:multiLevelType w:val="hybridMultilevel"/>
+    <w:tmpl w:val="1D5A889E"/>
+    <w:lvl w:ilvl="0" w:tplc="0409000F">
+      <w:start w:val="1"/>
+      <w:numFmt w:val="decimal"/>
+      <w:lvlText w:val="%1."/>
+      <w:lvlJc w:val="left"/>
+      <w:pPr>
+        <w:ind w:left="720" w:hanging="360"/>
+      </w:pPr>
+      <w:rPr>
+        <w:rFonts w:hint="default"/>
+      </w:rPr>
+    </w:lvl>
+    <w:lvl w:ilvl="1" w:tplc="04090019" w:tentative="1">
+      <w:start w:val="1"/>
+      <w:numFmt w:val="lowerLetter"/>
+      <w:lvlText w:val="%2."/>
+      <w:lvlJc w:val="left"/>
+      <w:pPr>
+        <w:ind w:left="1440" w:hanging="360"/>
+      </w:pPr>
+    </w:lvl>
+    <w:lvl w:ilvl="2" w:tplc="0409001B" w:tentative="1">
+      <w:start w:val="1"/>
+      <w:numFmt w:val="lowerRoman"/>
+      <w:lvlText w:val="%3."/>
+      <w:lvlJc w:val="right"/>
+      <w:pPr>
+        <w:ind w:left="2160" w:hanging="180"/>
+      </w:pPr>
+    </w:lvl>
+    <w:lvl w:ilvl="3" w:tplc="0409000F" w:tentative="1">
+      <w:start w:val="1"/>
+      <w:numFmt w:val="decimal"/>
+      <w:lvlText w:val="%4."/>
+      <w:lvlJc w:val="left"/>
+      <w:pPr>
+        <w:ind w:left="2880" w:hanging="360"/>
+      </w:pPr>
+    </w:lvl>
+    <w:lvl w:ilvl="4" w:tplc="04090019" w:tentative="1">
+      <w:start w:val="1"/>
+      <w:numFmt w:val="lowerLetter"/>
+      <w:lvlText w:val="%5."/>
+      <w:lvlJc w:val="left"/>
+      <w:pPr>
+        <w:ind w:left="3600" w:hanging="360"/>
+      </w:pPr>
+    </w:lvl>
+    <w:lvl w:ilvl="5" w:tplc="0409001B" w:tentative="1">
+      <w:start w:val="1"/>
+      <w:numFmt w:val="lowerRoman"/>
+      <w:lvlText w:val="%6."/>
+      <w:lvlJc w:val="right"/>
+      <w:pPr>
+        <w:ind w:left="4320" w:hanging="180"/>
+      </w:pPr>
+    </w:lvl>
+    <w:lvl w:ilvl="6" w:tplc="0409000F" w:tentative="1">
+      <w:start w:val="1"/>
+      <w:numFmt w:val="decimal"/>
+      <w:lvlText w:val="%7."/>
+      <w:lvlJc w:val="left"/>
+      <w:pPr>
+        <w:ind w:left="5040" w:hanging="360"/>
+      </w:pPr>
+    </w:lvl>
+    <w:lvl w:ilvl="7" w:tplc="04090019" w:tentative="1">
+      <w:start w:val="1"/>
+      <w:numFmt w:val="lowerLetter"/>
+      <w:lvlText w:val="%8."/>
+      <w:lvlJc w:val="left"/>
+      <w:pPr>
+        <w:ind w:left="5760" w:hanging="360"/>
+      </w:pPr>
+    </w:lvl>
+    <w:lvl w:ilvl="8" w:tplc="0409001B" w:tentative="1">
+      <w:start w:val="1"/>
+      <w:numFmt w:val="lowerRoman"/>
+      <w:lvlText w:val="%9."/>
+      <w:lvlJc w:val="right"/>
+      <w:pPr>
+        <w:ind w:left="6480" w:hanging="180"/>
+      </w:pPr>
+    </w:lvl>
+  </w:abstractNum>
+  <w:abstractNum w:abstractNumId="15" w15:restartNumberingAfterBreak="0">
     <w:nsid w:val="47ED02A9"/>
     <w:multiLevelType w:val="multilevel"/>
     <w:tmpl w:val="8B363A70"/>
@@ -60209,7 +60680,7 @@
       </w:pPr>
     </w:lvl>
   </w:abstractNum>
-  <w:abstractNum w:abstractNumId="14" w15:restartNumberingAfterBreak="0">
+  <w:abstractNum w:abstractNumId="16" w15:restartNumberingAfterBreak="0">
     <w:nsid w:val="4AD76DCD"/>
     <w:multiLevelType w:val="hybridMultilevel"/>
     <w:tmpl w:val="CFC08EAA"/>
@@ -60321,7 +60792,7 @@
       </w:rPr>
     </w:lvl>
   </w:abstractNum>
-  <w:abstractNum w:abstractNumId="15" w15:restartNumberingAfterBreak="0">
+  <w:abstractNum w:abstractNumId="17" w15:restartNumberingAfterBreak="0">
     <w:nsid w:val="4C4A74AA"/>
     <w:multiLevelType w:val="hybridMultilevel"/>
     <w:tmpl w:val="81AC4342"/>
@@ -60433,7 +60904,7 @@
       </w:rPr>
     </w:lvl>
   </w:abstractNum>
-  <w:abstractNum w:abstractNumId="16" w15:restartNumberingAfterBreak="0">
+  <w:abstractNum w:abstractNumId="18" w15:restartNumberingAfterBreak="0">
     <w:nsid w:val="4C5173EA"/>
     <w:multiLevelType w:val="hybridMultilevel"/>
     <w:tmpl w:val="53985B72"/>
@@ -60519,7 +60990,7 @@
       </w:pPr>
     </w:lvl>
   </w:abstractNum>
-  <w:abstractNum w:abstractNumId="17" w15:restartNumberingAfterBreak="0">
+  <w:abstractNum w:abstractNumId="19" w15:restartNumberingAfterBreak="0">
     <w:nsid w:val="527C16E1"/>
     <w:multiLevelType w:val="hybridMultilevel"/>
     <w:tmpl w:val="F04AC686"/>
@@ -60632,7 +61103,7 @@
       </w:rPr>
     </w:lvl>
   </w:abstractNum>
-  <w:abstractNum w:abstractNumId="18" w15:restartNumberingAfterBreak="0">
+  <w:abstractNum w:abstractNumId="20" w15:restartNumberingAfterBreak="0">
     <w:nsid w:val="543D7CB9"/>
     <w:multiLevelType w:val="multilevel"/>
     <w:tmpl w:val="4710C758"/>
@@ -60781,7 +61252,7 @@
       </w:rPr>
     </w:lvl>
   </w:abstractNum>
-  <w:abstractNum w:abstractNumId="19" w15:restartNumberingAfterBreak="0">
+  <w:abstractNum w:abstractNumId="21" w15:restartNumberingAfterBreak="0">
     <w:nsid w:val="579C38E0"/>
     <w:multiLevelType w:val="multilevel"/>
     <w:tmpl w:val="4574E294"/>
@@ -60894,7 +61365,7 @@
       </w:pPr>
     </w:lvl>
   </w:abstractNum>
-  <w:abstractNum w:abstractNumId="20" w15:restartNumberingAfterBreak="0">
+  <w:abstractNum w:abstractNumId="22" w15:restartNumberingAfterBreak="0">
     <w:nsid w:val="5BE47529"/>
     <w:multiLevelType w:val="multilevel"/>
     <w:tmpl w:val="CE284F70"/>
@@ -61043,7 +61514,7 @@
       </w:rPr>
     </w:lvl>
   </w:abstractNum>
-  <w:abstractNum w:abstractNumId="21" w15:restartNumberingAfterBreak="0">
+  <w:abstractNum w:abstractNumId="23" w15:restartNumberingAfterBreak="0">
     <w:nsid w:val="61373652"/>
     <w:multiLevelType w:val="hybridMultilevel"/>
     <w:tmpl w:val="E57C6F88"/>
@@ -61132,7 +61603,7 @@
       </w:pPr>
     </w:lvl>
   </w:abstractNum>
-  <w:abstractNum w:abstractNumId="22" w15:restartNumberingAfterBreak="0">
+  <w:abstractNum w:abstractNumId="24" w15:restartNumberingAfterBreak="0">
     <w:nsid w:val="639E6C92"/>
     <w:multiLevelType w:val="hybridMultilevel"/>
     <w:tmpl w:val="DCEABA9A"/>
@@ -61221,7 +61692,7 @@
       </w:pPr>
     </w:lvl>
   </w:abstractNum>
-  <w:abstractNum w:abstractNumId="23" w15:restartNumberingAfterBreak="0">
+  <w:abstractNum w:abstractNumId="25" w15:restartNumberingAfterBreak="0">
     <w:nsid w:val="6EB029E1"/>
     <w:multiLevelType w:val="hybridMultilevel"/>
     <w:tmpl w:val="CB6C8644"/>
@@ -61310,7 +61781,7 @@
       </w:pPr>
     </w:lvl>
   </w:abstractNum>
-  <w:abstractNum w:abstractNumId="24" w15:restartNumberingAfterBreak="0">
+  <w:abstractNum w:abstractNumId="26" w15:restartNumberingAfterBreak="0">
     <w:nsid w:val="7DF3159A"/>
     <w:multiLevelType w:val="hybridMultilevel"/>
     <w:tmpl w:val="DC46071C"/>
@@ -61424,13 +61895,13 @@
     </w:lvl>
   </w:abstractNum>
   <w:num w:numId="1" w16cid:durableId="1383673374">
-    <w:abstractNumId w:val="21"/>
+    <w:abstractNumId w:val="23"/>
   </w:num>
   <w:num w:numId="2" w16cid:durableId="165243697">
-    <w:abstractNumId w:val="12"/>
+    <w:abstractNumId w:val="13"/>
   </w:num>
   <w:num w:numId="3" w16cid:durableId="1651596104">
-    <w:abstractNumId w:val="22"/>
+    <w:abstractNumId w:val="24"/>
   </w:num>
   <w:num w:numId="4" w16cid:durableId="407116852">
     <w:abstractNumId w:val="2"/>
@@ -61439,28 +61910,28 @@
     <w:abstractNumId w:val="7"/>
   </w:num>
   <w:num w:numId="6" w16cid:durableId="1021660251">
-    <w:abstractNumId w:val="15"/>
+    <w:abstractNumId w:val="17"/>
   </w:num>
   <w:num w:numId="7" w16cid:durableId="280379279">
-    <w:abstractNumId w:val="14"/>
+    <w:abstractNumId w:val="16"/>
   </w:num>
   <w:num w:numId="8" w16cid:durableId="1021591556">
     <w:abstractNumId w:val="10"/>
   </w:num>
   <w:num w:numId="9" w16cid:durableId="897201342">
-    <w:abstractNumId w:val="16"/>
+    <w:abstractNumId w:val="18"/>
   </w:num>
   <w:num w:numId="10" w16cid:durableId="886259552">
-    <w:abstractNumId w:val="24"/>
+    <w:abstractNumId w:val="26"/>
   </w:num>
   <w:num w:numId="11" w16cid:durableId="1918200726">
-    <w:abstractNumId w:val="17"/>
+    <w:abstractNumId w:val="19"/>
   </w:num>
   <w:num w:numId="12" w16cid:durableId="1473711680">
-    <w:abstractNumId w:val="23"/>
+    <w:abstractNumId w:val="25"/>
   </w:num>
   <w:num w:numId="13" w16cid:durableId="761606157">
-    <w:abstractNumId w:val="13"/>
+    <w:abstractNumId w:val="15"/>
   </w:num>
   <w:num w:numId="14" w16cid:durableId="143550137">
     <w:abstractNumId w:val="5"/>
@@ -61478,13 +61949,13 @@
     <w:abstractNumId w:val="0"/>
   </w:num>
   <w:num w:numId="19" w16cid:durableId="52193205">
-    <w:abstractNumId w:val="19"/>
+    <w:abstractNumId w:val="21"/>
   </w:num>
   <w:num w:numId="20" w16cid:durableId="1909067785">
-    <w:abstractNumId w:val="20"/>
+    <w:abstractNumId w:val="22"/>
   </w:num>
   <w:num w:numId="21" w16cid:durableId="1069690456">
-    <w:abstractNumId w:val="11"/>
+    <w:abstractNumId w:val="12"/>
   </w:num>
   <w:num w:numId="22" w16cid:durableId="506212778">
     <w:abstractNumId w:val="6"/>
@@ -61493,10 +61964,16 @@
     <w:abstractNumId w:val="1"/>
   </w:num>
   <w:num w:numId="24" w16cid:durableId="288904877">
-    <w:abstractNumId w:val="18"/>
+    <w:abstractNumId w:val="20"/>
   </w:num>
   <w:num w:numId="25" w16cid:durableId="850879314">
     <w:abstractNumId w:val="9"/>
+  </w:num>
+  <w:num w:numId="26" w16cid:durableId="1125152827">
+    <w:abstractNumId w:val="11"/>
+  </w:num>
+  <w:num w:numId="27" w16cid:durableId="1930887804">
+    <w:abstractNumId w:val="14"/>
   </w:num>
 </w:numbering>
 </file>

</xml_diff>